<commit_message>
White paper: shorter introduction
Co-Authored-By: Claude Opus 5.5 <noreply@anthropic.com>
Claude-Session: https://claude.ai/code/session_01AcuW3xSnVc4HeTATtgPH4G
</commit_message>
<xml_diff>
--- a/Induced_Vibration_White_Paper.docx
+++ b/Induced_Vibration_White_Paper.docx
@@ -59,31 +59,19 @@
     <w:p>
       <w:pPr/>
       <w:r>
-        <w:t xml:space="preserve">Rotating hardware is common in precision systems. Momentum and reaction wheels store and exchange angular momentum, gimbals and rotating arms move instruments and payloads, and pumps, fans and cryocoolers keep equipment running. All of them share one side effect: they shake whatever they are attached to. This is called induced vibration. It is not a fault in the usual sense, because a rotor built to drawing and balanced to specification will still pass small forces and moments into its mount on every revolution. Those loads come from the limits of manufacturing: a center of mass a few micrometers off the axis, a part sitting a fraction of a degree crooked on its shaft, a bearing race that is not perfectly round, or a motor whose torque is not perfectly smooth.</w:t>
-      </w:r>
-    </w:p>
-    <w:p>
-      <w:pPr/>
-      <w:r>
-        <w:t xml:space="preserve">On their own these loads are small, often well under a newton. They matter because they are steady and periodic. A small force repeated thousands of times a minute at a fixed frequency can drive a structure into resonance, where the response is many times larger than the input. In pointing and optical systems this shows up as jitter, in sensitive instruments as noise, and in brackets and fasteners as fatigue over time. The sizes and frequencies of these loads are set early by decisions about speeds, balance tolerances and bearings, so they need to be understood while those decisions can still be changed.</w:t>
-      </w:r>
-    </w:p>
-    <w:p>
-      <w:pPr/>
-      <w:r>
-        <w:t xml:space="preserve">Our assembly contains three rotating parts: two momentum wheels and a rotating arm, each on its own stationary shaft supported by tapered roller bearings and driven by its own motor. The wheels spin opposite to the arm to cancel its angular momentum. The task was to determine the forces and moments these parts induce, including the disturbances generated by their bearings at harmonics of the arm and wheel speeds. The work had to be done at the design stage, before any hardware existed, using only CAD mass properties, the specified center of mass offset of each part, the operating speeds and profile, and catalog data for the bearings. No balance reports, bearing vibration data or test measurements were available.</w:t>
-      </w:r>
-    </w:p>
-    <w:p>
-      <w:pPr/>
-      <w:r>
-        <w:t xml:space="preserve">The aim was to identify every mechanism by which the rotating parts can load their mount, set out the governing equations for each, and build a method that estimates the resulting loads from design data alone and can be rerun by anyone with new inputs. The results are reported as the six load components Fx, Fy, Fz, Mx, My and Mz, for each source and for the assembly as a whole, with a clear statement of what is calculated, what is estimated, and what is left for later work. The paper deals with the source loads, meaning the loads the assembly would apply to a perfectly rigid mount, which is the standard way induced loads are defined and passed to other teams. How the real structure responds to them is a separate analysis.</w:t>
-      </w:r>
-    </w:p>
-    <w:p>
-      <w:pPr/>
-      <w:r>
-        <w:t xml:space="preserve">Section 2 introduces the fundamentals of induced vibration and describes each source in physical terms. Section 3 gathers the governing equations. Section 4 explains how induced vibration is characterized in practice. Section 5 describes our assembly and the information available, and Section 6 presents our method and the reasoning behind it. Section 7 covers assumptions and limitations, and Section 8 closes with next steps and conclusions.</w:t>
+        <w:t xml:space="preserve">Rotating hardware such as momentum wheels, gimbals, pumps and cryocoolers shakes whatever it is attached to. This is called induced vibration. Even a rotor built to drawing and balanced to specification passes small forces and moments into its mount on every revolution, because no part is made perfectly: its center of mass sits slightly off the axis, it sits slightly crooked on its shaft, and its bearings and motor are not perfectly smooth. The loads are small, but they repeat at fixed frequencies, and near a structural resonance they can be amplified into jitter, sensor noise or fatigue. Because their size and frequency are set early by choices about speeds, balance tolerances and bearings, they need to be understood early in the design.</w:t>
+      </w:r>
+    </w:p>
+    <w:p>
+      <w:pPr/>
+      <w:r>
+        <w:t xml:space="preserve">Our assembly contains two momentum wheels and a rotating arm, each on its own stationary shaft with tapered roller bearings and its own motor. The wheels spin opposite to the arm to cancel its angular momentum. The task was to determine the forces and moments these parts induce, including the bearing disturbances at harmonics of the arm and wheel speeds, before any hardware existed. The only inputs were CAD mass properties, the specified center of mass offsets, the operating speeds and profile, and bearing catalog data. This paper develops a method that estimates the resulting source loads, Fx, Fy, Fz, Mx, My and Mz, from that data alone, as they would act on a rigid mount.</w:t>
+      </w:r>
+    </w:p>
+    <w:p>
+      <w:pPr/>
+      <w:r>
+        <w:t xml:space="preserve">Section 2 describes the sources of induced vibration, Section 3 gives the governing equations, and Section 4 explains how induced vibration is characterized in practice. Sections 5 and 6 describe our assembly and our method. Section 7 covers assumptions and limitations, and Section 8 gives next steps and conclusions.</w:t>
       </w:r>
     </w:p>
     <w:p>

</xml_diff>

<commit_message>
White paper: reorder sections (fundamentals, system, coordinates, inputs, equations, method)
Co-Authored-By: Claude Opus 5.5 <noreply@anthropic.com>
Claude-Session: https://claude.ai/code/session_01AcuW3xSnVc4HeTATtgPH4G
</commit_message>
<xml_diff>
--- a/Induced_Vibration_White_Paper.docx
+++ b/Induced_Vibration_White_Paper.docx
@@ -45,7 +45,7 @@
     <w:p>
       <w:pPr/>
       <w:r>
-        <w:t xml:space="preserve">The second part applies those ideas to our assembly, which consists of two momentum wheels and a rotating arm, each on its own stationary shaft with a pair of tapered roller bearings. With no test data available, a purely analytical method was developed that estimates the six load components Fx, Fy, Fz, Mx, My and Mz from CAD mass properties, the eccentricity specification, the operating speeds and the bearing catalog. The paper describes how the method was put together, the choices made along the way and the reasons for them, how it was checked, and what it does not cover. The resulting loads are conservative, hard-mounted estimates intended for early design, and they are meant to be refined as balance data, supplier data and test results become available.</w:t>
+        <w:t xml:space="preserve">The second part applies those ideas to our assembly, which consists of two momentum wheels and a rotating arm, each on its own stationary shaft with a pair of tapered roller bearings. With no test data available, a purely analytical method was developed that estimates the six load components Fx, Fy, Fz, Mx, My and Mz from CAD mass properties, the eccentricity specification, the operating speeds and the bearing catalog. The paper describes how the method was put together, the choices made along the way and the reasons for them, and what it does not cover. The resulting loads are conservative, hard-mounted estimates intended for early design, and they are meant to be refined as balance data, supplier data and test results become available.</w:t>
       </w:r>
     </w:p>
     <w:p>
@@ -71,7 +71,7 @@
     <w:p>
       <w:pPr/>
       <w:r>
-        <w:t xml:space="preserve">Section 2 describes the sources of induced vibration, Section 3 gives the governing equations, and Section 4 explains how induced vibration is characterized in practice. Sections 5 and 6 describe our assembly and our method. Section 7 covers assumptions and limitations, and Section 8 gives next steps and conclusions.</w:t>
+        <w:t xml:space="preserve">Section 2 describes the sources of induced vibration and how they are characterized in practice. Section 3 describes our assembly, Section 4 defines the coordinate system and the loads, and Section 5 lists the model inputs. Section 6 gives the governing equations, and Section 7 explains how they are applied in our analysis method. Section 8 covers assumptions and limitations, and Section 9 gives next steps and conclusions.</w:t>
       </w:r>
     </w:p>
     <w:p>
@@ -924,10 +924,1538 @@
     </w:tbl>
     <w:p>
       <w:pPr>
+        <w:pStyle w:val="Heading3"/>
+      </w:pPr>
+      <w:r>
+        <w:t xml:space="preserve">2.9 How induced loads are characterized in practice</w:t>
+      </w:r>
+    </w:p>
+    <w:p>
+      <w:pPr/>
+      <w:r>
+        <w:t xml:space="preserve">The loads a machine passes into its surroundings depend partly on the machine and partly on what it is attached to. A soft mount lets the machine move, and a mount with a resonance near an operating frequency can amplify the loads. To keep the machine's own contribution separate, induced loads are normally defined as if the machine were bolted to a perfectly rigid base. These are called hard-mounted or blocked loads. They can be handed to any structural model, which then adds its own stiffness and damping to find the response, and they are also how hardware is tested: rotating units are mounted on a stiff force and moment table that records the six interface loads.</w:t>
+      </w:r>
+    </w:p>
+    <w:p>
+      <w:pPr/>
+      <w:r>
+        <w:t xml:space="preserve">Before hardware exists, the loads are estimated analytically. The imbalance terms can be predicted from mass properties and balance requirements with good confidence, and bearing and motor frequencies can be predicted exactly from geometry. The sizes of the bearing, motor and broadband disturbances cannot be predicted reliably and are added once test data is available. A widely used way of describing measured rotor disturbances is the empirical model developed for reaction wheels by Masterson, Miller and Grogan, in which each load is a sum of harmonics of the spin rate, each scaling with the square of the speed. The fundamental harmonic is the imbalance, and the other lines come from bearings, motors and other imperfections.</w:t>
+      </w:r>
+    </w:p>
+    <w:p>
+      <w:pPr/>
+      <w:r>
+        <w:t xml:space="preserve">A complete assessment moves from source loads, to refinement with supplier and test data, to a structural response analysis, to verification by test. This paper covers the first stage.</w:t>
+      </w:r>
+    </w:p>
+    <w:p>
+      <w:pPr>
         <w:pStyle w:val="Heading2"/>
       </w:pPr>
       <w:r>
-        <w:t xml:space="preserve">3. Governing Equations</w:t>
+        <w:t xml:space="preserve">3. System Description</w:t>
+      </w:r>
+    </w:p>
+    <w:p>
+      <w:pPr/>
+      <w:r>
+        <w:t xml:space="preserve">The assembly has three rotating parts arranged along a common line: a first momentum wheel, a rotating arm, and a second momentum wheel. Each turns on its own stationary shaft and is supported by a pair of tapered roller bearings mounted back to back. The outer ring of each bearing, the cup, turns with the rotating part, while the inner ring, the cone, is fixed to the shaft. Each part has its own drive motor.</w:t>
+      </w:r>
+    </w:p>
+    <w:p>
+      <w:pPr/>
+      <w:r>
+        <w:t xml:space="preserve">The arm is a long, slender body whose length runs perpendicular to its shaft. It turns about the shaft axis through complete revolutions, behaving like a seesaw that keeps going around rather than rocking back and forth. Because it is long and narrow, its inertia is very different about its two transverse axes, which matters for its dynamic imbalance.</w:t>
+      </w:r>
+    </w:p>
+    <w:p>
+      <w:pPr/>
+      <w:r>
+        <w:t xml:space="preserve">The two momentum wheels spin in the opposite direction to the arm and at a higher speed. Their purpose is to cancel the arm's angular momentum, so that the assembly as a whole does not exchange momentum with its mount when the parts speed up or slow down. The wheel speeds therefore track the arm speed at a fixed ratio.</w:t>
+      </w:r>
+    </w:p>
+    <w:p>
+      <w:pPr/>
+      <w:r>
+        <w:t xml:space="preserve">All three parts follow the same operating profile: a spin-up from rest to a hold speed, a period at constant speed, and a spin-down back to rest. The imbalance and bearing loads are largest during the hold, at maximum speed. The reaction torques from the motors act only during the spin-up and spin-down.</w:t>
+      </w:r>
+    </w:p>
+    <w:p>
+      <w:pPr>
+        <w:pStyle w:val="Heading2"/>
+      </w:pPr>
+      <w:r>
+        <w:t xml:space="preserve">4. Coordinate System and Load Definitions</w:t>
+      </w:r>
+    </w:p>
+    <w:p>
+      <w:pPr>
+        <w:pStyle w:val="Heading3"/>
+      </w:pPr>
+      <w:r>
+        <w:t xml:space="preserve">4.1 Axes and reference point</w:t>
+      </w:r>
+    </w:p>
+    <w:p>
+      <w:pPr/>
+      <w:r>
+        <w:t xml:space="preserve">A single right-handed coordinate system is used for the whole assembly. The z axis runs along the shafts, which is the spin axis of all three parts. The x and y axes lie perpendicular to the shafts. Because the shafts are parallel and share the same axis direction, every part's spin axis is the z axis, and no rotation between local and global axes is needed.</w:t>
+      </w:r>
+    </w:p>
+    <w:p>
+      <w:pPr/>
+      <w:r>
+        <w:t xml:space="preserve">The position of each rotating part is measured along z, at its center of mass, from a reference point. The reference point is the location where the loads are wanted, normally the interface where the assembly is mounted. All moments are reported about this point. Changing it changes the moments, because the lever arm of every sideways force changes, but it does not change the forces.</w:t>
+      </w:r>
+    </w:p>
+    <w:p>
+      <w:pPr/>
+      <w:r>
+        <w:t xml:space="preserve">Rotation direction is described by a sign. A part spinning in the positive sense about z has a spin direction of +1, and one spinning the other way has a spin direction of −1. In our assembly the arm and the wheels have opposite signs.</w:t>
+      </w:r>
+    </w:p>
+    <w:p>
+      <w:pPr>
+        <w:pStyle w:val="Heading3"/>
+      </w:pPr>
+      <w:r>
+        <w:t xml:space="preserve">4.2 The six load components</w:t>
+      </w:r>
+    </w:p>
+    <w:p>
+      <w:pPr/>
+      <w:r>
+        <w:t xml:space="preserve">The induced loads are reported as three forces and three moments at the reference point, which together describe everything the assembly can apply to its mount.</w:t>
+      </w:r>
+    </w:p>
+    <w:tbl>
+      <w:tblPr>
+        <w:tblStyle w:val="TableGrid"/>
+        <w:tblW w:w="0" w:type="auto"/>
+        <w:tblLayout w:type="fixed"/>
+        <w:tblLook w:val="04A0" w:firstRow="1" w:lastRow="0" w:firstColumn="0" w:lastColumn="0" w:noHBand="0" w:noVBand="1"/>
+      </w:tblPr>
+      <w:tblGrid>
+        <w:gridCol w:w="2340"/>
+        <w:gridCol w:w="2340"/>
+        <w:gridCol w:w="2340"/>
+        <w:gridCol w:w="2340"/>
+      </w:tblGrid>
+      <w:tr>
+        <w:trPr>
+          <w:tblHeader/>
+        </w:trPr>
+        <w:tc>
+          <w:tcPr>
+            <w:tcW w:w="2340" w:type="dxa"/>
+            <w:shd w:val="clear" w:color="auto" w:fill="F2F2F2"/>
+          </w:tcPr>
+          <w:p>
+            <w:pPr/>
+            <w:r>
+              <w:t xml:space="preserve">Component</w:t>
+            </w:r>
+          </w:p>
+        </w:tc>
+        <w:tc>
+          <w:tcPr>
+            <w:tcW w:w="2340" w:type="dxa"/>
+            <w:shd w:val="clear" w:color="auto" w:fill="F2F2F2"/>
+          </w:tcPr>
+          <w:p>
+            <w:pPr/>
+            <w:r>
+              <w:t xml:space="preserve">Direction</w:t>
+            </w:r>
+          </w:p>
+        </w:tc>
+        <w:tc>
+          <w:tcPr>
+            <w:tcW w:w="2340" w:type="dxa"/>
+            <w:shd w:val="clear" w:color="auto" w:fill="F2F2F2"/>
+          </w:tcPr>
+          <w:p>
+            <w:pPr/>
+            <w:r>
+              <w:t xml:space="preserve">Description</w:t>
+            </w:r>
+          </w:p>
+        </w:tc>
+        <w:tc>
+          <w:tcPr>
+            <w:tcW w:w="2340" w:type="dxa"/>
+            <w:shd w:val="clear" w:color="auto" w:fill="F2F2F2"/>
+          </w:tcPr>
+          <w:p>
+            <w:pPr/>
+            <w:r>
+              <w:t xml:space="preserve">Main sources</w:t>
+            </w:r>
+          </w:p>
+        </w:tc>
+      </w:tr>
+      <w:tr>
+        <w:tc>
+          <w:tcPr>
+            <w:tcW w:w="2340" w:type="dxa"/>
+          </w:tcPr>
+          <w:p>
+            <w:pPr/>
+            <w:r>
+              <w:t xml:space="preserve">Fx, Fy</w:t>
+            </w:r>
+          </w:p>
+        </w:tc>
+        <w:tc>
+          <w:tcPr>
+            <w:tcW w:w="2340" w:type="dxa"/>
+          </w:tcPr>
+          <w:p>
+            <w:pPr/>
+            <w:r>
+              <w:t xml:space="preserve">Perpendicular to the shafts</w:t>
+            </w:r>
+          </w:p>
+        </w:tc>
+        <w:tc>
+          <w:tcPr>
+            <w:tcW w:w="2340" w:type="dxa"/>
+          </w:tcPr>
+          <w:p>
+            <w:pPr/>
+            <w:r>
+              <w:t xml:space="preserve">Lateral (sideways) forces</w:t>
+            </w:r>
+          </w:p>
+        </w:tc>
+        <w:tc>
+          <w:tcPr>
+            <w:tcW w:w="2340" w:type="dxa"/>
+          </w:tcPr>
+          <w:p>
+            <w:pPr/>
+            <w:r>
+              <w:t xml:space="preserve">Static imbalance, bearings</w:t>
+            </w:r>
+          </w:p>
+        </w:tc>
+      </w:tr>
+      <w:tr>
+        <w:tc>
+          <w:tcPr>
+            <w:tcW w:w="2340" w:type="dxa"/>
+          </w:tcPr>
+          <w:p>
+            <w:pPr/>
+            <w:r>
+              <w:t xml:space="preserve">Fz</w:t>
+            </w:r>
+          </w:p>
+        </w:tc>
+        <w:tc>
+          <w:tcPr>
+            <w:tcW w:w="2340" w:type="dxa"/>
+          </w:tcPr>
+          <w:p>
+            <w:pPr/>
+            <w:r>
+              <w:t xml:space="preserve">Along the shafts</w:t>
+            </w:r>
+          </w:p>
+        </w:tc>
+        <w:tc>
+          <w:tcPr>
+            <w:tcW w:w="2340" w:type="dxa"/>
+          </w:tcPr>
+          <w:p>
+            <w:pPr/>
+            <w:r>
+              <w:t xml:space="preserve">Axial force</w:t>
+            </w:r>
+          </w:p>
+        </w:tc>
+        <w:tc>
+          <w:tcPr>
+            <w:tcW w:w="2340" w:type="dxa"/>
+          </w:tcPr>
+          <w:p>
+            <w:pPr/>
+            <w:r>
+              <w:t xml:space="preserve">Tapered roller bearings</w:t>
+            </w:r>
+          </w:p>
+        </w:tc>
+      </w:tr>
+      <w:tr>
+        <w:tc>
+          <w:tcPr>
+            <w:tcW w:w="2340" w:type="dxa"/>
+          </w:tcPr>
+          <w:p>
+            <w:pPr/>
+            <w:r>
+              <w:t xml:space="preserve">Mx, My</w:t>
+            </w:r>
+          </w:p>
+        </w:tc>
+        <w:tc>
+          <w:tcPr>
+            <w:tcW w:w="2340" w:type="dxa"/>
+          </w:tcPr>
+          <w:p>
+            <w:pPr/>
+            <w:r>
+              <w:t xml:space="preserve">About axes perpendicular to the shafts</w:t>
+            </w:r>
+          </w:p>
+        </w:tc>
+        <w:tc>
+          <w:tcPr>
+            <w:tcW w:w="2340" w:type="dxa"/>
+          </w:tcPr>
+          <w:p>
+            <w:pPr/>
+            <w:r>
+              <w:t xml:space="preserve">Rocking (tipping) moments</w:t>
+            </w:r>
+          </w:p>
+        </w:tc>
+        <w:tc>
+          <w:tcPr>
+            <w:tcW w:w="2340" w:type="dxa"/>
+          </w:tcPr>
+          <w:p>
+            <w:pPr/>
+            <w:r>
+              <w:t xml:space="preserve">Dynamic imbalance, lateral forces acting at a distance, bearings</w:t>
+            </w:r>
+          </w:p>
+        </w:tc>
+      </w:tr>
+      <w:tr>
+        <w:tc>
+          <w:tcPr>
+            <w:tcW w:w="2340" w:type="dxa"/>
+          </w:tcPr>
+          <w:p>
+            <w:pPr/>
+            <w:r>
+              <w:t xml:space="preserve">Mz</w:t>
+            </w:r>
+          </w:p>
+        </w:tc>
+        <w:tc>
+          <w:tcPr>
+            <w:tcW w:w="2340" w:type="dxa"/>
+          </w:tcPr>
+          <w:p>
+            <w:pPr/>
+            <w:r>
+              <w:t xml:space="preserve">About the shafts</w:t>
+            </w:r>
+          </w:p>
+        </w:tc>
+        <w:tc>
+          <w:tcPr>
+            <w:tcW w:w="2340" w:type="dxa"/>
+          </w:tcPr>
+          <w:p>
+            <w:pPr/>
+            <w:r>
+              <w:t xml:space="preserve">Twist</w:t>
+            </w:r>
+          </w:p>
+        </w:tc>
+        <w:tc>
+          <w:tcPr>
+            <w:tcW w:w="2340" w:type="dxa"/>
+          </w:tcPr>
+          <w:p>
+            <w:pPr/>
+            <w:r>
+              <w:t xml:space="preserve">Motor reaction torque during spin-up and spin-down</w:t>
+            </w:r>
+          </w:p>
+        </w:tc>
+      </w:tr>
+    </w:tbl>
+    <w:p>
+      <w:pPr>
+        <w:pStyle w:val="Heading3"/>
+      </w:pPr>
+      <w:r>
+        <w:t xml:space="preserve">4.3 Rotating loads and how they are reported</w:t>
+      </w:r>
+    </w:p>
+    <w:p>
+      <w:pPr/>
+      <w:r>
+        <w:t xml:space="preserve">The imbalance and most bearing loads rotate with the part that produces them. Seen from the fixed axes, a rotating force appears as an Fx component and an Fy component that rise and fall in turn, each reaching the same peak but a quarter of a revolution apart. The resultant sideways force at any instant equals that peak, not √2 times it. The same applies to Mx and My.</w:t>
+      </w:r>
+    </w:p>
+    <w:p>
+      <w:pPr/>
+      <w:r>
+        <w:t xml:space="preserve">For this reason, the loads in this paper are reported as peak amplitudes. Fx and Fy are listed separately because a structural model needs both directions, but they should not be combined as if they happened at the same time. Where the phases between different sources are unknown, the peaks of those sources are added, which gives an upper bound on the true load.</w:t>
+      </w:r>
+    </w:p>
+    <w:p>
+      <w:pPr/>
+      <w:r>
+        <w:t xml:space="preserve">Signs are kept where they carry meaning. The twist Mz is calculated with its sign, so that the twists of parts spinning in opposite directions cancel correctly when they are added. For all other components, which rotate, only the peak magnitude is reported.</w:t>
+      </w:r>
+    </w:p>
+    <w:p>
+      <w:pPr>
+        <w:pStyle w:val="Heading2"/>
+      </w:pPr>
+      <w:r>
+        <w:t xml:space="preserve">5. Model Inputs</w:t>
+      </w:r>
+    </w:p>
+    <w:p>
+      <w:pPr/>
+      <w:r>
+        <w:t xml:space="preserve">The analysis was carried out before any hardware was built, so every input comes from design data, specifications or catalogs. No balance reports, bearing vibration data or test measurements were available. The CAD models are symmetric, so on their own they show no imbalance at all. The real imbalance comes from manufacturing and assembly tolerances, which is why the eccentricity specification, rather than the CAD geometry, sets the static imbalance.</w:t>
+      </w:r>
+    </w:p>
+    <w:p>
+      <w:pPr>
+        <w:pStyle w:val="Heading3"/>
+      </w:pPr>
+      <w:r>
+        <w:t xml:space="preserve">5.1 Inputs for each rotating part</w:t>
+      </w:r>
+    </w:p>
+    <w:p>
+      <w:pPr/>
+      <w:r>
+        <w:t xml:space="preserve">The same set of inputs is supplied separately for each wheel and for the arm.</w:t>
+      </w:r>
+    </w:p>
+    <w:tbl>
+      <w:tblPr>
+        <w:tblStyle w:val="TableGrid"/>
+        <w:tblW w:w="0" w:type="auto"/>
+        <w:tblLayout w:type="fixed"/>
+        <w:tblLook w:val="04A0" w:firstRow="1" w:lastRow="0" w:firstColumn="0" w:lastColumn="0" w:noHBand="0" w:noVBand="1"/>
+      </w:tblPr>
+      <w:tblGrid>
+        <w:gridCol w:w="2340"/>
+        <w:gridCol w:w="2340"/>
+        <w:gridCol w:w="2340"/>
+        <w:gridCol w:w="2340"/>
+      </w:tblGrid>
+      <w:tr>
+        <w:trPr>
+          <w:tblHeader/>
+        </w:trPr>
+        <w:tc>
+          <w:tcPr>
+            <w:tcW w:w="2340" w:type="dxa"/>
+            <w:shd w:val="clear" w:color="auto" w:fill="F2F2F2"/>
+          </w:tcPr>
+          <w:p>
+            <w:pPr/>
+            <w:r>
+              <w:t xml:space="preserve">Input</w:t>
+            </w:r>
+          </w:p>
+        </w:tc>
+        <w:tc>
+          <w:tcPr>
+            <w:tcW w:w="2340" w:type="dxa"/>
+            <w:shd w:val="clear" w:color="auto" w:fill="F2F2F2"/>
+          </w:tcPr>
+          <w:p>
+            <w:pPr/>
+            <w:r>
+              <w:t xml:space="preserve">Symbol</w:t>
+            </w:r>
+          </w:p>
+        </w:tc>
+        <w:tc>
+          <w:tcPr>
+            <w:tcW w:w="2340" w:type="dxa"/>
+            <w:shd w:val="clear" w:color="auto" w:fill="F2F2F2"/>
+          </w:tcPr>
+          <w:p>
+            <w:pPr/>
+            <w:r>
+              <w:t xml:space="preserve">Units</w:t>
+            </w:r>
+          </w:p>
+        </w:tc>
+        <w:tc>
+          <w:tcPr>
+            <w:tcW w:w="2340" w:type="dxa"/>
+            <w:shd w:val="clear" w:color="auto" w:fill="F2F2F2"/>
+          </w:tcPr>
+          <w:p>
+            <w:pPr/>
+            <w:r>
+              <w:t xml:space="preserve">Source</w:t>
+            </w:r>
+          </w:p>
+        </w:tc>
+      </w:tr>
+      <w:tr>
+        <w:tc>
+          <w:tcPr>
+            <w:tcW w:w="2340" w:type="dxa"/>
+          </w:tcPr>
+          <w:p>
+            <w:pPr/>
+            <w:r>
+              <w:t xml:space="preserve">Rotating mass</w:t>
+            </w:r>
+          </w:p>
+        </w:tc>
+        <w:tc>
+          <w:tcPr>
+            <w:tcW w:w="2340" w:type="dxa"/>
+          </w:tcPr>
+          <w:p>
+            <w:pPr/>
+            <w:r>
+              <w:t xml:space="preserve">m</w:t>
+            </w:r>
+          </w:p>
+        </w:tc>
+        <w:tc>
+          <w:tcPr>
+            <w:tcW w:w="2340" w:type="dxa"/>
+          </w:tcPr>
+          <w:p>
+            <w:pPr/>
+            <w:r>
+              <w:t xml:space="preserve">kg</w:t>
+            </w:r>
+          </w:p>
+        </w:tc>
+        <w:tc>
+          <w:tcPr>
+            <w:tcW w:w="2340" w:type="dxa"/>
+          </w:tcPr>
+          <w:p>
+            <w:pPr/>
+            <w:r>
+              <w:t xml:space="preserve">CAD mass properties</w:t>
+            </w:r>
+          </w:p>
+        </w:tc>
+      </w:tr>
+      <w:tr>
+        <w:tc>
+          <w:tcPr>
+            <w:tcW w:w="2340" w:type="dxa"/>
+          </w:tcPr>
+          <w:p>
+            <w:pPr/>
+            <w:r>
+              <w:t xml:space="preserve">Center of mass offset (eccentricity)</w:t>
+            </w:r>
+          </w:p>
+        </w:tc>
+        <w:tc>
+          <w:tcPr>
+            <w:tcW w:w="2340" w:type="dxa"/>
+          </w:tcPr>
+          <w:p>
+            <w:pPr/>
+            <w:r>
+              <w:t xml:space="preserve">e</w:t>
+            </w:r>
+          </w:p>
+        </w:tc>
+        <w:tc>
+          <w:tcPr>
+            <w:tcW w:w="2340" w:type="dxa"/>
+          </w:tcPr>
+          <w:p>
+            <w:pPr/>
+            <w:r>
+              <w:t xml:space="preserve">µm</w:t>
+            </w:r>
+          </w:p>
+        </w:tc>
+        <w:tc>
+          <w:tcPr>
+            <w:tcW w:w="2340" w:type="dxa"/>
+          </w:tcPr>
+          <w:p>
+            <w:pPr/>
+            <w:r>
+              <w:t xml:space="preserve">Eccentricity specification</w:t>
+            </w:r>
+          </w:p>
+        </w:tc>
+      </w:tr>
+      <w:tr>
+        <w:tc>
+          <w:tcPr>
+            <w:tcW w:w="2340" w:type="dxa"/>
+          </w:tcPr>
+          <w:p>
+            <w:pPr/>
+            <w:r>
+              <w:t xml:space="preserve">Transverse moments of inertia, at the center of mass</w:t>
+            </w:r>
+          </w:p>
+        </w:tc>
+        <w:tc>
+          <w:tcPr>
+            <w:tcW w:w="2340" w:type="dxa"/>
+          </w:tcPr>
+          <w:p>
+            <w:pPr/>
+            <w:r>
+              <w:t xml:space="preserve">Ixx, Iyy</w:t>
+            </w:r>
+          </w:p>
+        </w:tc>
+        <w:tc>
+          <w:tcPr>
+            <w:tcW w:w="2340" w:type="dxa"/>
+          </w:tcPr>
+          <w:p>
+            <w:pPr/>
+            <w:r>
+              <w:t xml:space="preserve">kg·m²</w:t>
+            </w:r>
+          </w:p>
+        </w:tc>
+        <w:tc>
+          <w:tcPr>
+            <w:tcW w:w="2340" w:type="dxa"/>
+          </w:tcPr>
+          <w:p>
+            <w:pPr/>
+            <w:r>
+              <w:t xml:space="preserve">CAD mass properties</w:t>
+            </w:r>
+          </w:p>
+        </w:tc>
+      </w:tr>
+      <w:tr>
+        <w:tc>
+          <w:tcPr>
+            <w:tcW w:w="2340" w:type="dxa"/>
+          </w:tcPr>
+          <w:p>
+            <w:pPr/>
+            <w:r>
+              <w:t xml:space="preserve">Spin moment of inertia</w:t>
+            </w:r>
+          </w:p>
+        </w:tc>
+        <w:tc>
+          <w:tcPr>
+            <w:tcW w:w="2340" w:type="dxa"/>
+          </w:tcPr>
+          <w:p>
+            <w:pPr/>
+            <w:r>
+              <w:t xml:space="preserve">Izz</w:t>
+            </w:r>
+          </w:p>
+        </w:tc>
+        <w:tc>
+          <w:tcPr>
+            <w:tcW w:w="2340" w:type="dxa"/>
+          </w:tcPr>
+          <w:p>
+            <w:pPr/>
+            <w:r>
+              <w:t xml:space="preserve">kg·m²</w:t>
+            </w:r>
+          </w:p>
+        </w:tc>
+        <w:tc>
+          <w:tcPr>
+            <w:tcW w:w="2340" w:type="dxa"/>
+          </w:tcPr>
+          <w:p>
+            <w:pPr/>
+            <w:r>
+              <w:t xml:space="preserve">CAD mass properties</w:t>
+            </w:r>
+          </w:p>
+        </w:tc>
+      </w:tr>
+      <w:tr>
+        <w:tc>
+          <w:tcPr>
+            <w:tcW w:w="2340" w:type="dxa"/>
+          </w:tcPr>
+          <w:p>
+            <w:pPr/>
+            <w:r>
+              <w:t xml:space="preserve">Tilt of the principal axis from the shaft</w:t>
+            </w:r>
+          </w:p>
+        </w:tc>
+        <w:tc>
+          <w:tcPr>
+            <w:tcW w:w="2340" w:type="dxa"/>
+          </w:tcPr>
+          <w:p>
+            <w:pPr/>
+            <w:r>
+              <w:t xml:space="preserve">θ</w:t>
+            </w:r>
+          </w:p>
+        </w:tc>
+        <w:tc>
+          <w:tcPr>
+            <w:tcW w:w="2340" w:type="dxa"/>
+          </w:tcPr>
+          <w:p>
+            <w:pPr/>
+            <w:r>
+              <w:t xml:space="preserve">deg</w:t>
+            </w:r>
+          </w:p>
+        </w:tc>
+        <w:tc>
+          <w:tcPr>
+            <w:tcW w:w="2340" w:type="dxa"/>
+          </w:tcPr>
+          <w:p>
+            <w:pPr/>
+            <w:r>
+              <w:t xml:space="preserve">Estimate</w:t>
+            </w:r>
+          </w:p>
+        </w:tc>
+      </w:tr>
+      <w:tr>
+        <w:tc>
+          <w:tcPr>
+            <w:tcW w:w="2340" w:type="dxa"/>
+          </w:tcPr>
+          <w:p>
+            <w:pPr/>
+            <w:r>
+              <w:t xml:space="preserve">Static imbalance (optional)</w:t>
+            </w:r>
+          </w:p>
+        </w:tc>
+        <w:tc>
+          <w:tcPr>
+            <w:tcW w:w="2340" w:type="dxa"/>
+          </w:tcPr>
+          <w:p>
+            <w:pPr/>
+            <w:r>
+              <w:t xml:space="preserve">Us</w:t>
+            </w:r>
+          </w:p>
+        </w:tc>
+        <w:tc>
+          <w:tcPr>
+            <w:tcW w:w="2340" w:type="dxa"/>
+          </w:tcPr>
+          <w:p>
+            <w:pPr/>
+            <w:r>
+              <w:t xml:space="preserve">kg·m</w:t>
+            </w:r>
+          </w:p>
+        </w:tc>
+        <w:tc>
+          <w:tcPr>
+            <w:tcW w:w="2340" w:type="dxa"/>
+          </w:tcPr>
+          <w:p>
+            <w:pPr/>
+            <w:r>
+              <w:t xml:space="preserve">Balance specification, when available</w:t>
+            </w:r>
+          </w:p>
+        </w:tc>
+      </w:tr>
+      <w:tr>
+        <w:tc>
+          <w:tcPr>
+            <w:tcW w:w="2340" w:type="dxa"/>
+          </w:tcPr>
+          <w:p>
+            <w:pPr/>
+            <w:r>
+              <w:t xml:space="preserve">Dynamic imbalance (optional)</w:t>
+            </w:r>
+          </w:p>
+        </w:tc>
+        <w:tc>
+          <w:tcPr>
+            <w:tcW w:w="2340" w:type="dxa"/>
+          </w:tcPr>
+          <w:p>
+            <w:pPr/>
+            <w:r>
+              <w:t xml:space="preserve">Ud</w:t>
+            </w:r>
+          </w:p>
+        </w:tc>
+        <w:tc>
+          <w:tcPr>
+            <w:tcW w:w="2340" w:type="dxa"/>
+          </w:tcPr>
+          <w:p>
+            <w:pPr/>
+            <w:r>
+              <w:t xml:space="preserve">kg·m²</w:t>
+            </w:r>
+          </w:p>
+        </w:tc>
+        <w:tc>
+          <w:tcPr>
+            <w:tcW w:w="2340" w:type="dxa"/>
+          </w:tcPr>
+          <w:p>
+            <w:pPr/>
+            <w:r>
+              <w:t xml:space="preserve">Balance specification, when available</w:t>
+            </w:r>
+          </w:p>
+        </w:tc>
+      </w:tr>
+      <w:tr>
+        <w:tc>
+          <w:tcPr>
+            <w:tcW w:w="2340" w:type="dxa"/>
+          </w:tcPr>
+          <w:p>
+            <w:pPr/>
+            <w:r>
+              <w:t xml:space="preserve">Maximum (hold) speed</w:t>
+            </w:r>
+          </w:p>
+        </w:tc>
+        <w:tc>
+          <w:tcPr>
+            <w:tcW w:w="2340" w:type="dxa"/>
+          </w:tcPr>
+          <w:p>
+            <w:pPr/>
+            <w:r>
+              <w:t xml:space="preserve">N</w:t>
+            </w:r>
+          </w:p>
+        </w:tc>
+        <w:tc>
+          <w:tcPr>
+            <w:tcW w:w="2340" w:type="dxa"/>
+          </w:tcPr>
+          <w:p>
+            <w:pPr/>
+            <w:r>
+              <w:t xml:space="preserve">RPM</w:t>
+            </w:r>
+          </w:p>
+        </w:tc>
+        <w:tc>
+          <w:tcPr>
+            <w:tcW w:w="2340" w:type="dxa"/>
+          </w:tcPr>
+          <w:p>
+            <w:pPr/>
+            <w:r>
+              <w:t xml:space="preserve">Operating requirement</w:t>
+            </w:r>
+          </w:p>
+        </w:tc>
+      </w:tr>
+      <w:tr>
+        <w:tc>
+          <w:tcPr>
+            <w:tcW w:w="2340" w:type="dxa"/>
+          </w:tcPr>
+          <w:p>
+            <w:pPr/>
+            <w:r>
+              <w:t xml:space="preserve">Spin direction</w:t>
+            </w:r>
+          </w:p>
+        </w:tc>
+        <w:tc>
+          <w:tcPr>
+            <w:tcW w:w="2340" w:type="dxa"/>
+          </w:tcPr>
+          <w:p>
+            <w:pPr/>
+            <w:r>
+              <w:t xml:space="preserve">±1</w:t>
+            </w:r>
+          </w:p>
+        </w:tc>
+        <w:tc>
+          <w:tcPr>
+            <w:tcW w:w="2340" w:type="dxa"/>
+          </w:tcPr>
+          <w:p>
+            <w:pPr/>
+            <w:r>
+              <w:t xml:space="preserve">–</w:t>
+            </w:r>
+          </w:p>
+        </w:tc>
+        <w:tc>
+          <w:tcPr>
+            <w:tcW w:w="2340" w:type="dxa"/>
+          </w:tcPr>
+          <w:p>
+            <w:pPr/>
+            <w:r>
+              <w:t xml:space="preserve">Design</w:t>
+            </w:r>
+          </w:p>
+        </w:tc>
+      </w:tr>
+      <w:tr>
+        <w:tc>
+          <w:tcPr>
+            <w:tcW w:w="2340" w:type="dxa"/>
+          </w:tcPr>
+          <w:p>
+            <w:pPr/>
+            <w:r>
+              <w:t xml:space="preserve">Position along the shaft</w:t>
+            </w:r>
+          </w:p>
+        </w:tc>
+        <w:tc>
+          <w:tcPr>
+            <w:tcW w:w="2340" w:type="dxa"/>
+          </w:tcPr>
+          <w:p>
+            <w:pPr/>
+            <w:r>
+              <w:t xml:space="preserve">z</w:t>
+            </w:r>
+          </w:p>
+        </w:tc>
+        <w:tc>
+          <w:tcPr>
+            <w:tcW w:w="2340" w:type="dxa"/>
+          </w:tcPr>
+          <w:p>
+            <w:pPr/>
+            <w:r>
+              <w:t xml:space="preserve">m</w:t>
+            </w:r>
+          </w:p>
+        </w:tc>
+        <w:tc>
+          <w:tcPr>
+            <w:tcW w:w="2340" w:type="dxa"/>
+          </w:tcPr>
+          <w:p>
+            <w:pPr/>
+            <w:r>
+              <w:t xml:space="preserve">CAD</w:t>
+            </w:r>
+          </w:p>
+        </w:tc>
+      </w:tr>
+    </w:tbl>
+    <w:p>
+      <w:pPr>
+        <w:pStyle w:val="Heading3"/>
+      </w:pPr>
+      <w:r>
+        <w:t xml:space="preserve">5.2 Bearing inputs</w:t>
+      </w:r>
+    </w:p>
+    <w:p>
+      <w:pPr/>
+      <w:r>
+        <w:t xml:space="preserve">Each rotating part has its own pair of tapered roller bearings. Their geometry comes from the manufacturer's catalog for the selected part number.</w:t>
+      </w:r>
+    </w:p>
+    <w:tbl>
+      <w:tblPr>
+        <w:tblStyle w:val="TableGrid"/>
+        <w:tblW w:w="0" w:type="auto"/>
+        <w:tblLayout w:type="fixed"/>
+        <w:tblLook w:val="04A0" w:firstRow="1" w:lastRow="0" w:firstColumn="0" w:lastColumn="0" w:noHBand="0" w:noVBand="1"/>
+      </w:tblPr>
+      <w:tblGrid>
+        <w:gridCol w:w="2340"/>
+        <w:gridCol w:w="2340"/>
+        <w:gridCol w:w="2340"/>
+        <w:gridCol w:w="2340"/>
+      </w:tblGrid>
+      <w:tr>
+        <w:trPr>
+          <w:tblHeader/>
+        </w:trPr>
+        <w:tc>
+          <w:tcPr>
+            <w:tcW w:w="2340" w:type="dxa"/>
+            <w:shd w:val="clear" w:color="auto" w:fill="F2F2F2"/>
+          </w:tcPr>
+          <w:p>
+            <w:pPr/>
+            <w:r>
+              <w:t xml:space="preserve">Input</w:t>
+            </w:r>
+          </w:p>
+        </w:tc>
+        <w:tc>
+          <w:tcPr>
+            <w:tcW w:w="2340" w:type="dxa"/>
+            <w:shd w:val="clear" w:color="auto" w:fill="F2F2F2"/>
+          </w:tcPr>
+          <w:p>
+            <w:pPr/>
+            <w:r>
+              <w:t xml:space="preserve">Symbol</w:t>
+            </w:r>
+          </w:p>
+        </w:tc>
+        <w:tc>
+          <w:tcPr>
+            <w:tcW w:w="2340" w:type="dxa"/>
+            <w:shd w:val="clear" w:color="auto" w:fill="F2F2F2"/>
+          </w:tcPr>
+          <w:p>
+            <w:pPr/>
+            <w:r>
+              <w:t xml:space="preserve">Units</w:t>
+            </w:r>
+          </w:p>
+        </w:tc>
+        <w:tc>
+          <w:tcPr>
+            <w:tcW w:w="2340" w:type="dxa"/>
+            <w:shd w:val="clear" w:color="auto" w:fill="F2F2F2"/>
+          </w:tcPr>
+          <w:p>
+            <w:pPr/>
+            <w:r>
+              <w:t xml:space="preserve">Source</w:t>
+            </w:r>
+          </w:p>
+        </w:tc>
+      </w:tr>
+      <w:tr>
+        <w:tc>
+          <w:tcPr>
+            <w:tcW w:w="2340" w:type="dxa"/>
+          </w:tcPr>
+          <w:p>
+            <w:pPr/>
+            <w:r>
+              <w:t xml:space="preserve">Number of rollers</w:t>
+            </w:r>
+          </w:p>
+        </w:tc>
+        <w:tc>
+          <w:tcPr>
+            <w:tcW w:w="2340" w:type="dxa"/>
+          </w:tcPr>
+          <w:p>
+            <w:pPr/>
+            <w:r>
+              <w:t xml:space="preserve">Z</w:t>
+            </w:r>
+          </w:p>
+        </w:tc>
+        <w:tc>
+          <w:tcPr>
+            <w:tcW w:w="2340" w:type="dxa"/>
+          </w:tcPr>
+          <w:p>
+            <w:pPr/>
+            <w:r>
+              <w:t xml:space="preserve">–</w:t>
+            </w:r>
+          </w:p>
+        </w:tc>
+        <w:tc>
+          <w:tcPr>
+            <w:tcW w:w="2340" w:type="dxa"/>
+          </w:tcPr>
+          <w:p>
+            <w:pPr/>
+            <w:r>
+              <w:t xml:space="preserve">Bearing catalog</w:t>
+            </w:r>
+          </w:p>
+        </w:tc>
+      </w:tr>
+      <w:tr>
+        <w:tc>
+          <w:tcPr>
+            <w:tcW w:w="2340" w:type="dxa"/>
+          </w:tcPr>
+          <w:p>
+            <w:pPr/>
+            <w:r>
+              <w:t xml:space="preserve">Mean roller diameter</w:t>
+            </w:r>
+          </w:p>
+        </w:tc>
+        <w:tc>
+          <w:tcPr>
+            <w:tcW w:w="2340" w:type="dxa"/>
+          </w:tcPr>
+          <w:p>
+            <w:pPr/>
+            <w:r>
+              <w:t xml:space="preserve">d</w:t>
+            </w:r>
+          </w:p>
+        </w:tc>
+        <w:tc>
+          <w:tcPr>
+            <w:tcW w:w="2340" w:type="dxa"/>
+          </w:tcPr>
+          <w:p>
+            <w:pPr/>
+            <w:r>
+              <w:t xml:space="preserve">mm</w:t>
+            </w:r>
+          </w:p>
+        </w:tc>
+        <w:tc>
+          <w:tcPr>
+            <w:tcW w:w="2340" w:type="dxa"/>
+          </w:tcPr>
+          <w:p>
+            <w:pPr/>
+            <w:r>
+              <w:t xml:space="preserve">Bearing catalog</w:t>
+            </w:r>
+          </w:p>
+        </w:tc>
+      </w:tr>
+      <w:tr>
+        <w:tc>
+          <w:tcPr>
+            <w:tcW w:w="2340" w:type="dxa"/>
+          </w:tcPr>
+          <w:p>
+            <w:pPr/>
+            <w:r>
+              <w:t xml:space="preserve">Pitch diameter</w:t>
+            </w:r>
+          </w:p>
+        </w:tc>
+        <w:tc>
+          <w:tcPr>
+            <w:tcW w:w="2340" w:type="dxa"/>
+          </w:tcPr>
+          <w:p>
+            <w:pPr/>
+            <w:r>
+              <w:t xml:space="preserve">D</w:t>
+            </w:r>
+          </w:p>
+        </w:tc>
+        <w:tc>
+          <w:tcPr>
+            <w:tcW w:w="2340" w:type="dxa"/>
+          </w:tcPr>
+          <w:p>
+            <w:pPr/>
+            <w:r>
+              <w:t xml:space="preserve">mm</w:t>
+            </w:r>
+          </w:p>
+        </w:tc>
+        <w:tc>
+          <w:tcPr>
+            <w:tcW w:w="2340" w:type="dxa"/>
+          </w:tcPr>
+          <w:p>
+            <w:pPr/>
+            <w:r>
+              <w:t xml:space="preserve">Bearing catalog</w:t>
+            </w:r>
+          </w:p>
+        </w:tc>
+      </w:tr>
+      <w:tr>
+        <w:tc>
+          <w:tcPr>
+            <w:tcW w:w="2340" w:type="dxa"/>
+          </w:tcPr>
+          <w:p>
+            <w:pPr/>
+            <w:r>
+              <w:t xml:space="preserve">Cup (contact) angle</w:t>
+            </w:r>
+          </w:p>
+        </w:tc>
+        <w:tc>
+          <w:tcPr>
+            <w:tcW w:w="2340" w:type="dxa"/>
+          </w:tcPr>
+          <w:p>
+            <w:pPr/>
+            <w:r>
+              <w:t xml:space="preserve">α</w:t>
+            </w:r>
+          </w:p>
+        </w:tc>
+        <w:tc>
+          <w:tcPr>
+            <w:tcW w:w="2340" w:type="dxa"/>
+          </w:tcPr>
+          <w:p>
+            <w:pPr/>
+            <w:r>
+              <w:t xml:space="preserve">deg</w:t>
+            </w:r>
+          </w:p>
+        </w:tc>
+        <w:tc>
+          <w:tcPr>
+            <w:tcW w:w="2340" w:type="dxa"/>
+          </w:tcPr>
+          <w:p>
+            <w:pPr/>
+            <w:r>
+              <w:t xml:space="preserve">Bearing catalog</w:t>
+            </w:r>
+          </w:p>
+        </w:tc>
+      </w:tr>
+      <w:tr>
+        <w:tc>
+          <w:tcPr>
+            <w:tcW w:w="2340" w:type="dxa"/>
+          </w:tcPr>
+          <w:p>
+            <w:pPr/>
+            <w:r>
+              <w:t xml:space="preserve">Bearing kick ratio</w:t>
+            </w:r>
+          </w:p>
+        </w:tc>
+        <w:tc>
+          <w:tcPr>
+            <w:tcW w:w="2340" w:type="dxa"/>
+          </w:tcPr>
+          <w:p>
+            <w:pPr/>
+            <w:r>
+              <w:t xml:space="preserve">k</w:t>
+            </w:r>
+          </w:p>
+        </w:tc>
+        <w:tc>
+          <w:tcPr>
+            <w:tcW w:w="2340" w:type="dxa"/>
+          </w:tcPr>
+          <w:p>
+            <w:pPr/>
+            <w:r>
+              <w:t xml:space="preserve">–</w:t>
+            </w:r>
+          </w:p>
+        </w:tc>
+        <w:tc>
+          <w:tcPr>
+            <w:tcW w:w="2340" w:type="dxa"/>
+          </w:tcPr>
+          <w:p>
+            <w:pPr/>
+            <w:r>
+              <w:t xml:space="preserve">Estimate (1%)</w:t>
+            </w:r>
+          </w:p>
+        </w:tc>
+      </w:tr>
+    </w:tbl>
+    <w:p>
+      <w:pPr>
+        <w:pStyle w:val="Heading3"/>
+      </w:pPr>
+      <w:r>
+        <w:t xml:space="preserve">5.3 Operating and reporting inputs</w:t>
+      </w:r>
+    </w:p>
+    <w:tbl>
+      <w:tblPr>
+        <w:tblStyle w:val="TableGrid"/>
+        <w:tblW w:w="0" w:type="auto"/>
+        <w:tblLayout w:type="fixed"/>
+        <w:tblLook w:val="04A0" w:firstRow="1" w:lastRow="0" w:firstColumn="0" w:lastColumn="0" w:noHBand="0" w:noVBand="1"/>
+      </w:tblPr>
+      <w:tblGrid>
+        <w:gridCol w:w="2340"/>
+        <w:gridCol w:w="2340"/>
+        <w:gridCol w:w="2340"/>
+        <w:gridCol w:w="2340"/>
+      </w:tblGrid>
+      <w:tr>
+        <w:trPr>
+          <w:tblHeader/>
+        </w:trPr>
+        <w:tc>
+          <w:tcPr>
+            <w:tcW w:w="2340" w:type="dxa"/>
+            <w:shd w:val="clear" w:color="auto" w:fill="F2F2F2"/>
+          </w:tcPr>
+          <w:p>
+            <w:pPr/>
+            <w:r>
+              <w:t xml:space="preserve">Input</w:t>
+            </w:r>
+          </w:p>
+        </w:tc>
+        <w:tc>
+          <w:tcPr>
+            <w:tcW w:w="2340" w:type="dxa"/>
+            <w:shd w:val="clear" w:color="auto" w:fill="F2F2F2"/>
+          </w:tcPr>
+          <w:p>
+            <w:pPr/>
+            <w:r>
+              <w:t xml:space="preserve">Symbol</w:t>
+            </w:r>
+          </w:p>
+        </w:tc>
+        <w:tc>
+          <w:tcPr>
+            <w:tcW w:w="2340" w:type="dxa"/>
+            <w:shd w:val="clear" w:color="auto" w:fill="F2F2F2"/>
+          </w:tcPr>
+          <w:p>
+            <w:pPr/>
+            <w:r>
+              <w:t xml:space="preserve">Units</w:t>
+            </w:r>
+          </w:p>
+        </w:tc>
+        <w:tc>
+          <w:tcPr>
+            <w:tcW w:w="2340" w:type="dxa"/>
+            <w:shd w:val="clear" w:color="auto" w:fill="F2F2F2"/>
+          </w:tcPr>
+          <w:p>
+            <w:pPr/>
+            <w:r>
+              <w:t xml:space="preserve">Source</w:t>
+            </w:r>
+          </w:p>
+        </w:tc>
+      </w:tr>
+      <w:tr>
+        <w:tc>
+          <w:tcPr>
+            <w:tcW w:w="2340" w:type="dxa"/>
+          </w:tcPr>
+          <w:p>
+            <w:pPr/>
+            <w:r>
+              <w:t xml:space="preserve">Spin-up time</w:t>
+            </w:r>
+          </w:p>
+        </w:tc>
+        <w:tc>
+          <w:tcPr>
+            <w:tcW w:w="2340" w:type="dxa"/>
+          </w:tcPr>
+          <w:p>
+            <w:pPr/>
+            <w:r>
+              <w:t xml:space="preserve">t_up</w:t>
+            </w:r>
+          </w:p>
+        </w:tc>
+        <w:tc>
+          <w:tcPr>
+            <w:tcW w:w="2340" w:type="dxa"/>
+          </w:tcPr>
+          <w:p>
+            <w:pPr/>
+            <w:r>
+              <w:t xml:space="preserve">s</w:t>
+            </w:r>
+          </w:p>
+        </w:tc>
+        <w:tc>
+          <w:tcPr>
+            <w:tcW w:w="2340" w:type="dxa"/>
+          </w:tcPr>
+          <w:p>
+            <w:pPr/>
+            <w:r>
+              <w:t xml:space="preserve">Motor control profile</w:t>
+            </w:r>
+          </w:p>
+        </w:tc>
+      </w:tr>
+      <w:tr>
+        <w:tc>
+          <w:tcPr>
+            <w:tcW w:w="2340" w:type="dxa"/>
+          </w:tcPr>
+          <w:p>
+            <w:pPr/>
+            <w:r>
+              <w:t xml:space="preserve">Spin-down time</w:t>
+            </w:r>
+          </w:p>
+        </w:tc>
+        <w:tc>
+          <w:tcPr>
+            <w:tcW w:w="2340" w:type="dxa"/>
+          </w:tcPr>
+          <w:p>
+            <w:pPr/>
+            <w:r>
+              <w:t xml:space="preserve">t_down</w:t>
+            </w:r>
+          </w:p>
+        </w:tc>
+        <w:tc>
+          <w:tcPr>
+            <w:tcW w:w="2340" w:type="dxa"/>
+          </w:tcPr>
+          <w:p>
+            <w:pPr/>
+            <w:r>
+              <w:t xml:space="preserve">s</w:t>
+            </w:r>
+          </w:p>
+        </w:tc>
+        <w:tc>
+          <w:tcPr>
+            <w:tcW w:w="2340" w:type="dxa"/>
+          </w:tcPr>
+          <w:p>
+            <w:pPr/>
+            <w:r>
+              <w:t xml:space="preserve">Motor control profile</w:t>
+            </w:r>
+          </w:p>
+        </w:tc>
+      </w:tr>
+      <w:tr>
+        <w:tc>
+          <w:tcPr>
+            <w:tcW w:w="2340" w:type="dxa"/>
+          </w:tcPr>
+          <w:p>
+            <w:pPr/>
+            <w:r>
+              <w:t xml:space="preserve">Reference point position</w:t>
+            </w:r>
+          </w:p>
+        </w:tc>
+        <w:tc>
+          <w:tcPr>
+            <w:tcW w:w="2340" w:type="dxa"/>
+          </w:tcPr>
+          <w:p>
+            <w:pPr/>
+            <w:r>
+              <w:t xml:space="preserve">z_ref</w:t>
+            </w:r>
+          </w:p>
+        </w:tc>
+        <w:tc>
+          <w:tcPr>
+            <w:tcW w:w="2340" w:type="dxa"/>
+          </w:tcPr>
+          <w:p>
+            <w:pPr/>
+            <w:r>
+              <w:t xml:space="preserve">m</w:t>
+            </w:r>
+          </w:p>
+        </w:tc>
+        <w:tc>
+          <w:tcPr>
+            <w:tcW w:w="2340" w:type="dxa"/>
+          </w:tcPr>
+          <w:p>
+            <w:pPr/>
+            <w:r>
+              <w:t xml:space="preserve">Mounting interface location</w:t>
+            </w:r>
+          </w:p>
+        </w:tc>
+      </w:tr>
+      <w:tr>
+        <w:tc>
+          <w:tcPr>
+            <w:tcW w:w="2340" w:type="dxa"/>
+          </w:tcPr>
+          <w:p>
+            <w:pPr/>
+            <w:r>
+              <w:t xml:space="preserve">Other speeds of interest</w:t>
+            </w:r>
+          </w:p>
+        </w:tc>
+        <w:tc>
+          <w:tcPr>
+            <w:tcW w:w="2340" w:type="dxa"/>
+          </w:tcPr>
+          <w:p>
+            <w:pPr/>
+            <w:r>
+              <w:t xml:space="preserve">–</w:t>
+            </w:r>
+          </w:p>
+        </w:tc>
+        <w:tc>
+          <w:tcPr>
+            <w:tcW w:w="2340" w:type="dxa"/>
+          </w:tcPr>
+          <w:p>
+            <w:pPr/>
+            <w:r>
+              <w:t xml:space="preserve">RPM</w:t>
+            </w:r>
+          </w:p>
+        </w:tc>
+        <w:tc>
+          <w:tcPr>
+            <w:tcW w:w="2340" w:type="dxa"/>
+          </w:tcPr>
+          <w:p>
+            <w:pPr/>
+            <w:r>
+              <w:t xml:space="preserve">As requested</w:t>
+            </w:r>
+          </w:p>
+        </w:tc>
+      </w:tr>
+    </w:tbl>
+    <w:p>
+      <w:pPr>
+        <w:pStyle w:val="Heading3"/>
+      </w:pPr>
+      <w:r>
+        <w:t xml:space="preserve">5.4 Calculated, estimated and optional inputs</w:t>
+      </w:r>
+    </w:p>
+    <w:p>
+      <w:pPr/>
+      <w:r>
+        <w:t xml:space="preserve">Most inputs are taken directly from CAD, specifications or catalogs. Two are estimates. The tilt θ has no specified tolerance, so a small value consistent with ordinary machining and assembly practice is used. The bearing kick ratio k stands in for bearing vibration data, which can only come from the supplier or a test.</w:t>
+      </w:r>
+    </w:p>
+    <w:p>
+      <w:pPr/>
+      <w:r>
+        <w:t xml:space="preserve">Static and dynamic imbalance can be supplied in two ways. If they are left blank, they are calculated from the other inputs, as Us = m × e and Ud = |Izz − I⊥| × θ. If a balance specification or report gives them directly, those values are entered instead and take priority. Entering Ud this way removes the need for the tilt estimate.</w:t>
+      </w:r>
+    </w:p>
+    <w:p>
+      <w:pPr>
+        <w:pStyle w:val="Heading2"/>
+      </w:pPr>
+      <w:r>
+        <w:t xml:space="preserve">6. Governing Equations</w:t>
       </w:r>
     </w:p>
     <w:p>
@@ -941,7 +2469,7 @@
         <w:pStyle w:val="Heading3"/>
       </w:pPr>
       <w:r>
-        <w:t xml:space="preserve">3.1 Equations of motion</w:t>
+        <w:t xml:space="preserve">6.1 Equations of motion</w:t>
       </w:r>
     </w:p>
     <w:p>
@@ -965,7 +2493,7 @@
         <w:pStyle w:val="Heading3"/>
       </w:pPr>
       <w:r>
-        <w:t xml:space="preserve">3.2 Static imbalance</w:t>
+        <w:t xml:space="preserve">6.2 Static imbalance</w:t>
       </w:r>
     </w:p>
     <w:p>
@@ -1005,7 +2533,7 @@
         <w:pStyle w:val="Heading3"/>
       </w:pPr>
       <w:r>
-        <w:t xml:space="preserve">3.3 Dynamic imbalance</w:t>
+        <w:t xml:space="preserve">6.3 Dynamic imbalance</w:t>
       </w:r>
     </w:p>
     <w:p>
@@ -1045,7 +2573,7 @@
         <w:pStyle w:val="Heading3"/>
       </w:pPr>
       <w:r>
-        <w:t xml:space="preserve">3.4 Rotating loads and transfer to a reference point</w:t>
+        <w:t xml:space="preserve">6.4 Rotating loads and transfer to a reference point</w:t>
       </w:r>
     </w:p>
     <w:p>
@@ -1091,7 +2619,7 @@
         <w:pStyle w:val="Heading3"/>
       </w:pPr>
       <w:r>
-        <w:t xml:space="preserve">3.5 Motor reaction torque</w:t>
+        <w:t xml:space="preserve">6.5 Motor reaction torque</w:t>
       </w:r>
     </w:p>
     <w:p>
@@ -1137,7 +2665,7 @@
         <w:pStyle w:val="Heading3"/>
       </w:pPr>
       <w:r>
-        <w:t xml:space="preserve">3.6 Bearing characteristic frequencies</w:t>
+        <w:t xml:space="preserve">6.6 Bearing characteristic frequencies</w:t>
       </w:r>
     </w:p>
     <w:p>
@@ -1209,7 +2737,7 @@
         <w:pStyle w:val="Heading3"/>
       </w:pPr>
       <w:r>
-        <w:t xml:space="preserve">3.7 Motor ripple and cogging frequencies</w:t>
+        <w:t xml:space="preserve">6.7 Motor ripple and cogging frequencies</w:t>
       </w:r>
     </w:p>
     <w:p>
@@ -1239,7 +2767,7 @@
         <w:pStyle w:val="Heading3"/>
       </w:pPr>
       <w:r>
-        <w:t xml:space="preserve">3.8 Gyroscopic moment</w:t>
+        <w:t xml:space="preserve">6.8 Gyroscopic moment</w:t>
       </w:r>
     </w:p>
     <w:p>
@@ -1279,7 +2807,7 @@
         <w:pStyle w:val="Heading3"/>
       </w:pPr>
       <w:r>
-        <w:t xml:space="preserve">3.9 Broadband noise</w:t>
+        <w:t xml:space="preserve">6.9 Broadband noise</w:t>
       </w:r>
     </w:p>
     <w:p>
@@ -1303,7 +2831,7 @@
         <w:pStyle w:val="Heading3"/>
       </w:pPr>
       <w:r>
-        <w:t xml:space="preserve">3.10 Speed scaling and superposition</w:t>
+        <w:t xml:space="preserve">6.10 Speed scaling and superposition</w:t>
       </w:r>
     </w:p>
     <w:p>
@@ -1343,7 +2871,7 @@
         <w:pStyle w:val="Heading3"/>
       </w:pPr>
       <w:r>
-        <w:t xml:space="preserve">3.11 Nomenclature</w:t>
+        <w:t xml:space="preserve">6.11 Nomenclature</w:t>
       </w:r>
     </w:p>
     <w:tbl>
@@ -1663,7 +3191,7 @@
           <w:p>
             <w:pPr/>
             <w:r>
-              <w:t xml:space="preserve">Angular acceleration (Section 3.5); bearing contact angle (Section 3.6)</w:t>
+              <w:t xml:space="preserve">Angular acceleration (Section 6.5); bearing contact angle (Section 6.6)</w:t>
             </w:r>
           </w:p>
         </w:tc>
@@ -2035,7 +3563,7 @@
         <w:pStyle w:val="Heading2"/>
       </w:pPr>
       <w:r>
-        <w:t xml:space="preserve">4. How Induced Vibration Is Characterized in Practice</w:t>
+        <w:t xml:space="preserve">7. Analysis Method</w:t>
       </w:r>
     </w:p>
     <w:p>
@@ -2043,19 +3571,31 @@
         <w:pStyle w:val="Heading3"/>
       </w:pPr>
       <w:r>
-        <w:t xml:space="preserve">4.1 Source loads and the hard-mounted convention</w:t>
-      </w:r>
-    </w:p>
-    <w:p>
-      <w:pPr/>
-      <w:r>
-        <w:t xml:space="preserve">The loads a machine passes into its surroundings depend partly on the machine and partly on what it is attached to. A soft mount lets the machine move, which changes the forces at the interface, and a mount with a resonance near an operating frequency can amplify them. To keep the machine's own contribution separate from the structure's, induced loads are normally defined as if the machine were bolted to a perfectly rigid base. These are called hard-mounted or blocked loads.</w:t>
-      </w:r>
-    </w:p>
-    <w:p>
-      <w:pPr/>
-      <w:r>
-        <w:t xml:space="preserve">The hard-mounted convention is what makes the loads portable. The same set of source loads can be handed to any structural model, which then adds its own stiffness and damping to work out the response. It is also how loads are measured: suppliers of reaction wheels and similar hardware test them on a stiff force and moment table and report the six interface load components.</w:t>
+        <w:t xml:space="preserve">7.1 Overall approach</w:t>
+      </w:r>
+    </w:p>
+    <w:p>
+      <w:pPr/>
+      <w:r>
+        <w:t xml:space="preserve">The method follows directly from the fundamentals in Section 2 and the equations in Section 6. Each rotating part is treated as a rigid rotor and examined for the three rotor effects: static imbalance, dynamic imbalance and reaction torque. The bearings under each part are then treated as a fourth source. The loads from every source are expressed as the six components Fx, Fy, Fz, Mx, My and Mz at a single reference point and added together.</w:t>
+      </w:r>
+    </w:p>
+    <w:p>
+      <w:pPr/>
+      <w:r>
+        <w:t xml:space="preserve">Three decisions frame everything that follows. First, the loads are hard-mounted, following the convention described in Section 2.9, so that they can be handed to a structural model without double counting the structure's response. Second, the results are peak amplitudes at the maximum operating speed, which is where imbalance loads are largest. Third, because the relative phases between sources are unknown, every peak is added as if it occurs at the same instant. Real loads will be equal to or lower than the reported values. Together these choices give an answer that is conservative, easy to check by hand, and in the form most useful at the early design stage.</w:t>
+      </w:r>
+    </w:p>
+    <w:p>
+      <w:pPr/>
+      <w:r>
+        <w:t xml:space="preserve">All three parts are handled by the same equations and the same code. Nothing in the method is specific to wheels or arms, so it applies equally to any number of rotors on parallel shafts, provided the inputs for each are supplied.</w:t>
+      </w:r>
+    </w:p>
+    <w:p>
+      <w:pPr/>
+      <w:r>
+        <w:t xml:space="preserve">Of the sources described in Section 2, the method includes those that can be estimated from the design data available: static imbalance, dynamic imbalance, motor reaction torque and the bearings. The remaining sources are left out for specific reasons. Motor ripple and cogging need the motor pole and slot counts and ripple data, which were not yet available. Broadband noise has no deterministic model and can only be measured. Gyroscopic moments are zero because all three shafts are stationary, and even if the assembly were carried on a moving base, the counter-rotating wheels are sized to bring its total angular momentum close to zero. Each of these can be added later without changing the rest of the method.</w:t>
       </w:r>
     </w:p>
     <w:p>
@@ -2063,33 +3603,13 @@
         <w:pStyle w:val="Heading3"/>
       </w:pPr>
       <w:r>
-        <w:t xml:space="preserve">4.2 Analysis before hardware, measurement after</w:t>
-      </w:r>
-    </w:p>
-    <w:p>
-      <w:pPr/>
-      <w:r>
-        <w:t xml:space="preserve">Before hardware exists, induced loads are estimated analytically from design data. The imbalance terms can be predicted from mass properties and balance requirements with good confidence, because the physics is simple and the inputs are well defined. Bearing frequencies can be predicted exactly from geometry. What cannot be predicted reliably is the size of the bearing disturbances, the higher harmonics, the motor ripple and the broadband content, since all of these depend on details of the finished hardware.</w:t>
-      </w:r>
-    </w:p>
-    <w:p>
-      <w:pPr/>
-      <w:r>
-        <w:t xml:space="preserve">Once hardware exists, it is tested. The measured loads replace the analytical estimates and fill in the terms that could not be calculated. The analytical model is then checked against the test, and any large disagreement points to an input that was wrong, such as a balance that was worse than specified.</w:t>
-      </w:r>
-    </w:p>
-    <w:p>
-      <w:pPr>
-        <w:pStyle w:val="Heading3"/>
-      </w:pPr>
-      <w:r>
-        <w:t xml:space="preserve">4.3 The harmonic disturbance model</w:t>
-      </w:r>
-    </w:p>
-    <w:p>
-      <w:pPr/>
-      <w:r>
-        <w:t xml:space="preserve">A widely used way of describing measured rotor disturbances is the empirical model developed for reaction wheels by Masterson, Miller and Grogan. Each load component is written as a sum of harmonics of the spin rate, each scaling with the square of the speed:</w:t>
+        <w:t xml:space="preserve">7.2 Static imbalance from the eccentricity specification</w:t>
+      </w:r>
+    </w:p>
+    <w:p>
+      <w:pPr/>
+      <w:r>
+        <w:t xml:space="preserve">Because the CAD models are symmetric, the static imbalance was taken from the eccentricity specification rather than from the geometry. For each part, the specified offset e is multiplied by the rotating mass to give Us, and the lateral force at maximum speed follows from the square of the spin rate:</w:t>
       </w:r>
     </w:p>
     <w:p>
@@ -2099,19 +3619,19 @@
       <w:bookmarkStart w:id="20" w:name="bongo_lang_latex_20"/>
       <w:bookmarkEnd w:id="20"/>
       <w:r>
-        <w:t xml:space="preserve">F(t) = \sum_{i} C_i\,\Omega^2 \sin\left(2\pi h_i \Omega t + \phi_i\right)</w:t>
-      </w:r>
-    </w:p>
-    <w:p>
-      <w:pPr/>
-      <w:r>
-        <w:t xml:space="preserve">Here Ω is the wheel speed, h_i is the harmonic number of each line, C_i is its amplitude coefficient and φ_i its phase. The fundamental, h = 1, is the imbalance term. The other lines come from the bearings, the motor and other imperfections, and their coefficients are fitted from test data.</w:t>
-      </w:r>
-    </w:p>
-    <w:p>
-      <w:pPr/>
-      <w:r>
-        <w:t xml:space="preserve">The analytical method described later in this paper is a special case of this model. Static and dynamic imbalance supply the h = 1 coefficients directly, as Us and Ud. Bearing geometry supplies the harmonic numbers of the bearing lines, and their coefficients are estimated until test data replaces them.</w:t>
+        <w:t xml:space="preserve">U_s = m\,e \qquad\qquad F_s = U_s\,\omega^2, \qquad \omega = \frac{2\pi\,\text{RPM}}{60}</w:t>
+      </w:r>
+    </w:p>
+    <w:p>
+      <w:pPr/>
+      <w:r>
+        <w:t xml:space="preserve">This force rotates with the part. It appears at the reference point as Fx and Fy, each with the same peak value, reached a quarter of a revolution apart. It produces no axial force.</w:t>
+      </w:r>
+    </w:p>
+    <w:p>
+      <w:pPr/>
+      <w:r>
+        <w:t xml:space="preserve">The method also allows Us to be entered directly. Once a balance specification or a balance report is available, its value replaces the one calculated from eccentricity, and the rest of the method is unchanged.</w:t>
       </w:r>
     </w:p>
     <w:p>
@@ -2119,13 +3639,145 @@
         <w:pStyle w:val="Heading3"/>
       </w:pPr>
       <w:r>
-        <w:t xml:space="preserve">4.4 How results are reported</w:t>
-      </w:r>
-    </w:p>
-    <w:p>
-      <w:pPr/>
-      <w:r>
-        <w:t xml:space="preserve">Induced loads can be reported in several forms, depending on what the receiving team needs.</w:t>
+        <w:t xml:space="preserve">7.3 Dynamic imbalance from inertia and an estimated tilt</w:t>
+      </w:r>
+    </w:p>
+    <w:p>
+      <w:pPr/>
+      <w:r>
+        <w:t xml:space="preserve">Dynamic imbalance needs two inputs: the difference between the spin and transverse inertias, which comes from CAD, and the tilt of the principal axis relative to the shaft, which was not specified. A small tilt was therefore assumed for each part, of a size consistent with ordinary machining and assembly tolerances. This is the least certain input in the imbalance calculation and is flagged as such in the results.</w:t>
+      </w:r>
+    </w:p>
+    <w:p>
+      <w:pPr/>
+      <w:r>
+        <w:t xml:space="preserve">The direction of the tilt is also unknown. For a rotor with equal transverse inertias, such as a wheel, this does not matter. For the arm it matters a great deal, because its inertia about one transverse axis is close to its spin inertia while its inertia about the other is very small. The method uses the larger of the two inertia differences, which corresponds to the worst tilt direction:</w:t>
+      </w:r>
+    </w:p>
+    <w:p>
+      <w:pPr>
+        <w:pStyle w:val="Code"/>
+      </w:pPr>
+      <w:bookmarkStart w:id="21" w:name="bongo_lang_latex_21"/>
+      <w:bookmarkEnd w:id="21"/>
+      <w:r>
+        <w:t xml:space="preserve">U_d = \max\left(\left|I_{zz}-I_{xx}\right|,\ \left|I_{zz}-I_{yy}\right|\right)\theta \qquad\qquad M_d = U_d\,\omega^2</w:t>
+      </w:r>
+    </w:p>
+    <w:p>
+      <w:pPr/>
+      <w:r>
+        <w:t xml:space="preserve">As with static imbalance, Ud can be entered directly when a balance specification provides it, and doing so removes the need for the tilt estimate altogether.</w:t>
+      </w:r>
+    </w:p>
+    <w:p>
+      <w:pPr>
+        <w:pStyle w:val="Heading3"/>
+      </w:pPr>
+      <w:r>
+        <w:t xml:space="preserve">7.4 Moments at the reference point</w:t>
+      </w:r>
+    </w:p>
+    <w:p>
+      <w:pPr/>
+      <w:r>
+        <w:t xml:space="preserve">Each part sits some distance L along the shaft from the reference point. Its lateral force therefore produces an additional moment at that point, on top of its own dynamic imbalance moment. The angle between the heavy spot and the direction of tilt is not known, so the two moments are added at full value:</w:t>
+      </w:r>
+    </w:p>
+    <w:p>
+      <w:pPr>
+        <w:pStyle w:val="Code"/>
+      </w:pPr>
+      <w:bookmarkStart w:id="22" w:name="bongo_lang_latex_22"/>
+      <w:bookmarkEnd w:id="22"/>
+      <w:r>
+        <w:t xml:space="preserve">M_x = M_y = M_d + F_s\,L, \qquad L = \left|z - z_{ref}\right|</w:t>
+      </w:r>
+    </w:p>
+    <w:p>
+      <w:pPr/>
+      <w:r>
+        <w:t xml:space="preserve">Moving the reference point changes the moments but not the forces. This lets the same calculation report loads at whichever interface the structures team needs.</w:t>
+      </w:r>
+    </w:p>
+    <w:p>
+      <w:pPr>
+        <w:pStyle w:val="Heading3"/>
+      </w:pPr>
+      <w:r>
+        <w:t xml:space="preserve">7.5 Twist during spin-up and spin-down</w:t>
+      </w:r>
+    </w:p>
+    <w:p>
+      <w:pPr/>
+      <w:r>
+        <w:t xml:space="preserve">The twist about the shaft was calculated from the spin inertia and the average angular acceleration of each ramp, treating spin-up and spin-down separately because they can have different durations:</w:t>
+      </w:r>
+    </w:p>
+    <w:p>
+      <w:pPr>
+        <w:pStyle w:val="Code"/>
+      </w:pPr>
+      <w:bookmarkStart w:id="23" w:name="bongo_lang_latex_23"/>
+      <w:bookmarkEnd w:id="23"/>
+      <w:r>
+        <w:t xml:space="preserve">M_{z,up} = -\,I_{zz}\,\frac{\omega}{t_{up}} \qquad\qquad M_{z,down} = +\,I_{zz}\,\frac{\omega}{t_{down}}</w:t>
+      </w:r>
+    </w:p>
+    <w:p>
+      <w:pPr/>
+      <w:r>
+        <w:t xml:space="preserve">The signs show that the mount is twisted one way during spin-up and the other way during spin-down, and that parts turning in opposite directions twist it in opposite senses. The load tables carry the larger of the two values for each part. When the twists of all three parts are added with their signs, the counter-rotating wheels largely cancel the arm, which is the purpose of the wheels. The net value is reported as the assembly's twist, but each motor mount still carries its own full torque, and those values are reported separately so that the individual mounts can be checked.</w:t>
+      </w:r>
+    </w:p>
+    <w:p>
+      <w:pPr>
+        <w:pStyle w:val="Heading3"/>
+      </w:pPr>
+      <w:r>
+        <w:t xml:space="preserve">7.6 Bearings</w:t>
+      </w:r>
+    </w:p>
+    <w:p>
+      <w:pPr/>
+      <w:r>
+        <w:t xml:space="preserve">The bearing calculation has two parts with very different levels of confidence. The frequencies are exact. For each part, the catalog geometry gives the cage, cup pass, cone pass and roller spin harmonics, using the cup-rotating forms from Section 6.6, and each harmonic is multiplied by the shaft speed to give its frequency in hertz. These frequencies are reported in full because they are what a structural analyst needs to check for resonance.</w:t>
+      </w:r>
+    </w:p>
+    <w:p>
+      <w:pPr/>
+      <w:r>
+        <w:t xml:space="preserve">The amplitudes are estimated. With no supplier or test data, each bearing harmonic was assumed to produce a lateral force equal to a small fraction k of that part's static imbalance force. A value of 1% was used. Tying the bearing estimate to the imbalance force keeps it in proportion to the size and speed of the part, and keeping k as a single, clearly labeled input makes it easy to change once real data arrives. Because the rollers in a tapered bearing sit at the cup angle α, each lateral kick was given an axial component as well. The four harmonics were added at full value:</w:t>
+      </w:r>
+    </w:p>
+    <w:p>
+      <w:pPr>
+        <w:pStyle w:val="Code"/>
+      </w:pPr>
+      <w:bookmarkStart w:id="24" w:name="bongo_lang_latex_24"/>
+      <w:bookmarkEnd w:id="24"/>
+      <w:r>
+        <w:t xml:space="preserve">F_{lat} = 4\,k\,F_s \qquad\qquad F_{ax} = F_{lat}\tan\alpha \qquad\qquad M_{x} = M_{y} = F_{lat}\,L</w:t>
+      </w:r>
+    </w:p>
+    <w:p>
+      <w:pPr/>
+      <w:r>
+        <w:t xml:space="preserve">The two bearings of each back-to-back pair were treated together as a single source at the part's position. A more detailed model would place each bearing separately and account for preload, but that refinement only becomes meaningful once the amplitudes themselves are known.</w:t>
+      </w:r>
+    </w:p>
+    <w:p>
+      <w:pPr>
+        <w:pStyle w:val="Heading3"/>
+      </w:pPr>
+      <w:r>
+        <w:t xml:space="preserve">7.7 Combining the sources</w:t>
+      </w:r>
+    </w:p>
+    <w:p>
+      <w:pPr/>
+      <w:r>
+        <w:t xml:space="preserve">With every source expressed as six load components at the same reference point, the totals are found by adding them. The arm, the two wheels and all of the bearings are summed component by component. The twist is added with its sign, and its magnitude is reported as the net assembly twist. The results are presented in four groups so that each contribution can be seen on its own: the arm, the wheels, the bearings, and the assembly as a whole.</w:t>
       </w:r>
     </w:p>
     <w:tbl>
@@ -2152,7 +3804,7 @@
           <w:p>
             <w:pPr/>
             <w:r>
-              <w:t xml:space="preserve">Form</w:t>
+              <w:t xml:space="preserve">Load</w:t>
             </w:r>
           </w:p>
         </w:tc>
@@ -2164,7 +3816,7 @@
           <w:p>
             <w:pPr/>
             <w:r>
-              <w:t xml:space="preserve">What it shows</w:t>
+              <w:t xml:space="preserve">Arm and each wheel</w:t>
             </w:r>
           </w:p>
         </w:tc>
@@ -2176,826 +3828,164 @@
           <w:p>
             <w:pPr/>
             <w:r>
-              <w:t xml:space="preserve">Typical use</w:t>
-            </w:r>
-          </w:p>
-        </w:tc>
-      </w:tr>
-      <w:tr>
-        <w:tc>
-          <w:tcPr>
-            <w:tcW w:w="3120" w:type="dxa"/>
-          </w:tcPr>
-          <w:p>
-            <w:pPr/>
-            <w:r>
-              <w:t xml:space="preserve">Peak amplitudes</w:t>
-            </w:r>
-          </w:p>
-        </w:tc>
-        <w:tc>
-          <w:tcPr>
-            <w:tcW w:w="3120" w:type="dxa"/>
-          </w:tcPr>
-          <w:p>
-            <w:pPr/>
-            <w:r>
-              <w:t xml:space="preserve">The largest value of each load component at a given speed</w:t>
-            </w:r>
-          </w:p>
-        </w:tc>
-        <w:tc>
-          <w:tcPr>
-            <w:tcW w:w="3120" w:type="dxa"/>
-          </w:tcPr>
-          <w:p>
-            <w:pPr/>
-            <w:r>
-              <w:t xml:space="preserve">Early design, load envelopes, quick comparisons</w:t>
-            </w:r>
-          </w:p>
-        </w:tc>
-      </w:tr>
-      <w:tr>
-        <w:tc>
-          <w:tcPr>
-            <w:tcW w:w="3120" w:type="dxa"/>
-          </w:tcPr>
-          <w:p>
-            <w:pPr/>
-            <w:r>
-              <w:t xml:space="preserve">Harmonic tables</w:t>
-            </w:r>
-          </w:p>
-        </w:tc>
-        <w:tc>
-          <w:tcPr>
-            <w:tcW w:w="3120" w:type="dxa"/>
-          </w:tcPr>
-          <w:p>
-            <w:pPr/>
-            <w:r>
-              <w:t xml:space="preserve">Frequency and amplitude of each disturbance line</w:t>
-            </w:r>
-          </w:p>
-        </w:tc>
-        <w:tc>
-          <w:tcPr>
-            <w:tcW w:w="3120" w:type="dxa"/>
-          </w:tcPr>
-          <w:p>
-            <w:pPr/>
-            <w:r>
-              <w:t xml:space="preserve">Input to frequency-domain structural analysis</w:t>
-            </w:r>
-          </w:p>
-        </w:tc>
-      </w:tr>
-      <w:tr>
-        <w:tc>
-          <w:tcPr>
-            <w:tcW w:w="3120" w:type="dxa"/>
-          </w:tcPr>
-          <w:p>
-            <w:pPr/>
-            <w:r>
-              <w:t xml:space="preserve">Time histories</w:t>
-            </w:r>
-          </w:p>
-        </w:tc>
-        <w:tc>
-          <w:tcPr>
-            <w:tcW w:w="3120" w:type="dxa"/>
-          </w:tcPr>
-          <w:p>
-            <w:pPr/>
-            <w:r>
-              <w:t xml:space="preserve">Loads as functions of time through a maneuver</w:t>
-            </w:r>
-          </w:p>
-        </w:tc>
-        <w:tc>
-          <w:tcPr>
-            <w:tcW w:w="3120" w:type="dxa"/>
-          </w:tcPr>
-          <w:p>
-            <w:pPr/>
-            <w:r>
-              <w:t xml:space="preserve">Transient and jitter simulation</w:t>
-            </w:r>
-          </w:p>
-        </w:tc>
-      </w:tr>
-      <w:tr>
-        <w:tc>
-          <w:tcPr>
-            <w:tcW w:w="3120" w:type="dxa"/>
-          </w:tcPr>
-          <w:p>
-            <w:pPr/>
-            <w:r>
-              <w:t xml:space="preserve">Spectra and waterfall plots</w:t>
-            </w:r>
-          </w:p>
-        </w:tc>
-        <w:tc>
-          <w:tcPr>
-            <w:tcW w:w="3120" w:type="dxa"/>
-          </w:tcPr>
-          <w:p>
-            <w:pPr/>
-            <w:r>
-              <w:t xml:space="preserve">Amplitude against frequency, across the speed range</w:t>
-            </w:r>
-          </w:p>
-        </w:tc>
-        <w:tc>
-          <w:tcPr>
-            <w:tcW w:w="3120" w:type="dxa"/>
-          </w:tcPr>
-          <w:p>
-            <w:pPr/>
-            <w:r>
-              <w:t xml:space="preserve">Finding where disturbance lines cross structural modes</w:t>
+              <w:t xml:space="preserve">Bearings</w:t>
+            </w:r>
+          </w:p>
+        </w:tc>
+      </w:tr>
+      <w:tr>
+        <w:tc>
+          <w:tcPr>
+            <w:tcW w:w="3120" w:type="dxa"/>
+          </w:tcPr>
+          <w:p>
+            <w:pPr/>
+            <w:r>
+              <w:t xml:space="preserve">Fx, Fy</w:t>
+            </w:r>
+          </w:p>
+        </w:tc>
+        <w:tc>
+          <w:tcPr>
+            <w:tcW w:w="3120" w:type="dxa"/>
+          </w:tcPr>
+          <w:p>
+            <w:pPr/>
+            <w:r>
+              <w:t xml:space="preserve">Fs</w:t>
+            </w:r>
+          </w:p>
+        </w:tc>
+        <w:tc>
+          <w:tcPr>
+            <w:tcW w:w="3120" w:type="dxa"/>
+          </w:tcPr>
+          <w:p>
+            <w:pPr/>
+            <w:r>
+              <w:t xml:space="preserve">F_lat</w:t>
+            </w:r>
+          </w:p>
+        </w:tc>
+      </w:tr>
+      <w:tr>
+        <w:tc>
+          <w:tcPr>
+            <w:tcW w:w="3120" w:type="dxa"/>
+          </w:tcPr>
+          <w:p>
+            <w:pPr/>
+            <w:r>
+              <w:t xml:space="preserve">Fz</w:t>
+            </w:r>
+          </w:p>
+        </w:tc>
+        <w:tc>
+          <w:tcPr>
+            <w:tcW w:w="3120" w:type="dxa"/>
+          </w:tcPr>
+          <w:p>
+            <w:pPr/>
+            <w:r>
+              <w:t xml:space="preserve">0</w:t>
+            </w:r>
+          </w:p>
+        </w:tc>
+        <w:tc>
+          <w:tcPr>
+            <w:tcW w:w="3120" w:type="dxa"/>
+          </w:tcPr>
+          <w:p>
+            <w:pPr/>
+            <w:r>
+              <w:t xml:space="preserve">F_ax</w:t>
+            </w:r>
+          </w:p>
+        </w:tc>
+      </w:tr>
+      <w:tr>
+        <w:tc>
+          <w:tcPr>
+            <w:tcW w:w="3120" w:type="dxa"/>
+          </w:tcPr>
+          <w:p>
+            <w:pPr/>
+            <w:r>
+              <w:t xml:space="preserve">Mx, My</w:t>
+            </w:r>
+          </w:p>
+        </w:tc>
+        <w:tc>
+          <w:tcPr>
+            <w:tcW w:w="3120" w:type="dxa"/>
+          </w:tcPr>
+          <w:p>
+            <w:pPr/>
+            <w:r>
+              <w:t xml:space="preserve">Md + Fs × L</w:t>
+            </w:r>
+          </w:p>
+        </w:tc>
+        <w:tc>
+          <w:tcPr>
+            <w:tcW w:w="3120" w:type="dxa"/>
+          </w:tcPr>
+          <w:p>
+            <w:pPr/>
+            <w:r>
+              <w:t xml:space="preserve">F_lat × L</w:t>
+            </w:r>
+          </w:p>
+        </w:tc>
+      </w:tr>
+      <w:tr>
+        <w:tc>
+          <w:tcPr>
+            <w:tcW w:w="3120" w:type="dxa"/>
+          </w:tcPr>
+          <w:p>
+            <w:pPr/>
+            <w:r>
+              <w:t xml:space="preserve">Mz</w:t>
+            </w:r>
+          </w:p>
+        </w:tc>
+        <w:tc>
+          <w:tcPr>
+            <w:tcW w:w="3120" w:type="dxa"/>
+          </w:tcPr>
+          <w:p>
+            <w:pPr/>
+            <w:r>
+              <w:t xml:space="preserve">Izz × ω / t (larger ramp)</w:t>
+            </w:r>
+          </w:p>
+        </w:tc>
+        <w:tc>
+          <w:tcPr>
+            <w:tcW w:w="3120" w:type="dxa"/>
+          </w:tcPr>
+          <w:p>
+            <w:pPr/>
+            <w:r>
+              <w:t xml:space="preserve">0, since bearing drag is reacted inside the assembly by the motor</w:t>
             </w:r>
           </w:p>
         </w:tc>
       </w:tr>
     </w:tbl>
     <w:p>
-      <w:pPr/>
-      <w:r>
-        <w:t xml:space="preserve">Peak amplitudes are the usual starting point and are what this paper produces. When the phases between sources are unknown, the peaks are added as if they all occur together. This gives an upper bound that is simple to check and safe to design against.</w:t>
-      </w:r>
-    </w:p>
-    <w:p>
       <w:pPr>
         <w:pStyle w:val="Heading3"/>
       </w:pPr>
       <w:r>
-        <w:t xml:space="preserve">4.5 Where source loads fit in the bigger picture</w:t>
-      </w:r>
-    </w:p>
-    <w:p>
-      <w:pPr/>
-      <w:r>
-        <w:t xml:space="preserve">A complete induced vibration assessment moves through several stages. The source loads are estimated, then refined with data, then applied to a structural model to find the response, and finally checked by test.</w:t>
-      </w:r>
-    </w:p>
-    <w:tbl>
-      <w:tblPr>
-        <w:tblStyle w:val="TableGrid"/>
-        <w:tblW w:w="0" w:type="auto"/>
-        <w:tblLayout w:type="fixed"/>
-        <w:tblLook w:val="04A0" w:firstRow="1" w:lastRow="0" w:firstColumn="0" w:lastColumn="0" w:noHBand="0" w:noVBand="1"/>
-      </w:tblPr>
-      <w:tblGrid>
-        <w:gridCol w:w="3120"/>
-        <w:gridCol w:w="3120"/>
-        <w:gridCol w:w="3120"/>
-      </w:tblGrid>
-      <w:tr>
-        <w:trPr>
-          <w:tblHeader/>
-        </w:trPr>
-        <w:tc>
-          <w:tcPr>
-            <w:tcW w:w="3120" w:type="dxa"/>
-            <w:shd w:val="clear" w:color="auto" w:fill="F2F2F2"/>
-          </w:tcPr>
-          <w:p>
-            <w:pPr/>
-            <w:r>
-              <w:t xml:space="preserve">Stage</w:t>
-            </w:r>
-          </w:p>
-        </w:tc>
-        <w:tc>
-          <w:tcPr>
-            <w:tcW w:w="3120" w:type="dxa"/>
-            <w:shd w:val="clear" w:color="auto" w:fill="F2F2F2"/>
-          </w:tcPr>
-          <w:p>
-            <w:pPr/>
-            <w:r>
-              <w:t xml:space="preserve">Question answered</w:t>
-            </w:r>
-          </w:p>
-        </w:tc>
-        <w:tc>
-          <w:tcPr>
-            <w:tcW w:w="3120" w:type="dxa"/>
-            <w:shd w:val="clear" w:color="auto" w:fill="F2F2F2"/>
-          </w:tcPr>
-          <w:p>
-            <w:pPr/>
-            <w:r>
-              <w:t xml:space="preserve">Normally done by</w:t>
-            </w:r>
-          </w:p>
-        </w:tc>
-      </w:tr>
-      <w:tr>
-        <w:tc>
-          <w:tcPr>
-            <w:tcW w:w="3120" w:type="dxa"/>
-          </w:tcPr>
-          <w:p>
-            <w:pPr/>
-            <w:r>
-              <w:t xml:space="preserve">Source loads</w:t>
-            </w:r>
-          </w:p>
-        </w:tc>
-        <w:tc>
-          <w:tcPr>
-            <w:tcW w:w="3120" w:type="dxa"/>
-          </w:tcPr>
-          <w:p>
-            <w:pPr/>
-            <w:r>
-              <w:t xml:space="preserve">How hard does the machine push on its mount, and at what frequencies?</w:t>
-            </w:r>
-          </w:p>
-        </w:tc>
-        <w:tc>
-          <w:tcPr>
-            <w:tcW w:w="3120" w:type="dxa"/>
-          </w:tcPr>
-          <w:p>
-            <w:pPr/>
-            <w:r>
-              <w:t xml:space="preserve">Mechanism or component engineer</w:t>
-            </w:r>
-          </w:p>
-        </w:tc>
-      </w:tr>
-      <w:tr>
-        <w:tc>
-          <w:tcPr>
-            <w:tcW w:w="3120" w:type="dxa"/>
-          </w:tcPr>
-          <w:p>
-            <w:pPr/>
-            <w:r>
-              <w:t xml:space="preserve">Refinement</w:t>
-            </w:r>
-          </w:p>
-        </w:tc>
-        <w:tc>
-          <w:tcPr>
-            <w:tcW w:w="3120" w:type="dxa"/>
-          </w:tcPr>
-          <w:p>
-            <w:pPr/>
-            <w:r>
-              <w:t xml:space="preserve">What do supplier data and component tests say?</w:t>
-            </w:r>
-          </w:p>
-        </w:tc>
-        <w:tc>
-          <w:tcPr>
-            <w:tcW w:w="3120" w:type="dxa"/>
-          </w:tcPr>
-          <w:p>
-            <w:pPr/>
-            <w:r>
-              <w:t xml:space="preserve">Component engineer, with suppliers</w:t>
-            </w:r>
-          </w:p>
-        </w:tc>
-      </w:tr>
-      <w:tr>
-        <w:tc>
-          <w:tcPr>
-            <w:tcW w:w="3120" w:type="dxa"/>
-          </w:tcPr>
-          <w:p>
-            <w:pPr/>
-            <w:r>
-              <w:t xml:space="preserve">Structural response</w:t>
-            </w:r>
-          </w:p>
-        </w:tc>
-        <w:tc>
-          <w:tcPr>
-            <w:tcW w:w="3120" w:type="dxa"/>
-          </w:tcPr>
-          <w:p>
-            <w:pPr/>
-            <w:r>
-              <w:t xml:space="preserve">How does the structure amplify or attenuate those loads?</w:t>
-            </w:r>
-          </w:p>
-        </w:tc>
-        <w:tc>
-          <w:tcPr>
-            <w:tcW w:w="3120" w:type="dxa"/>
-          </w:tcPr>
-          <w:p>
-            <w:pPr/>
-            <w:r>
-              <w:t xml:space="preserve">Structures team</w:t>
-            </w:r>
-          </w:p>
-        </w:tc>
-      </w:tr>
-      <w:tr>
-        <w:tc>
-          <w:tcPr>
-            <w:tcW w:w="3120" w:type="dxa"/>
-          </w:tcPr>
-          <w:p>
-            <w:pPr/>
-            <w:r>
-              <w:t xml:space="preserve">System effect</w:t>
-            </w:r>
-          </w:p>
-        </w:tc>
-        <w:tc>
-          <w:tcPr>
-            <w:tcW w:w="3120" w:type="dxa"/>
-          </w:tcPr>
-          <w:p>
-            <w:pPr/>
-            <w:r>
-              <w:t xml:space="preserve">What does the response do to pointing, sensors or fatigue life?</w:t>
-            </w:r>
-          </w:p>
-        </w:tc>
-        <w:tc>
-          <w:tcPr>
-            <w:tcW w:w="3120" w:type="dxa"/>
-          </w:tcPr>
-          <w:p>
-            <w:pPr/>
-            <w:r>
-              <w:t xml:space="preserve">Systems and controls teams</w:t>
-            </w:r>
-          </w:p>
-        </w:tc>
-      </w:tr>
-      <w:tr>
-        <w:tc>
-          <w:tcPr>
-            <w:tcW w:w="3120" w:type="dxa"/>
-          </w:tcPr>
-          <w:p>
-            <w:pPr/>
-            <w:r>
-              <w:t xml:space="preserve">Verification</w:t>
-            </w:r>
-          </w:p>
-        </w:tc>
-        <w:tc>
-          <w:tcPr>
-            <w:tcW w:w="3120" w:type="dxa"/>
-          </w:tcPr>
-          <w:p>
-            <w:pPr/>
-            <w:r>
-              <w:t xml:space="preserve">Do measured loads and responses agree with the predictions?</w:t>
-            </w:r>
-          </w:p>
-        </w:tc>
-        <w:tc>
-          <w:tcPr>
-            <w:tcW w:w="3120" w:type="dxa"/>
-          </w:tcPr>
-          <w:p>
-            <w:pPr/>
-            <w:r>
-              <w:t xml:space="preserve">Test team</w:t>
-            </w:r>
-          </w:p>
-        </w:tc>
-      </w:tr>
-    </w:tbl>
-    <w:p>
-      <w:pPr/>
-      <w:r>
-        <w:t xml:space="preserve">This paper covers the first stage for our assembly.</w:t>
-      </w:r>
-    </w:p>
-    <w:p>
-      <w:pPr>
-        <w:pStyle w:val="Heading2"/>
-      </w:pPr>
-      <w:r>
-        <w:t xml:space="preserve">5. Our System</w:t>
-      </w:r>
-    </w:p>
-    <w:p>
-      <w:pPr>
-        <w:pStyle w:val="Heading3"/>
-      </w:pPr>
-      <w:r>
-        <w:t xml:space="preserve">5.1 Layout and operation</w:t>
-      </w:r>
-    </w:p>
-    <w:p>
-      <w:pPr/>
-      <w:r>
-        <w:t xml:space="preserve">The assembly has three rotating parts arranged along a common line: a first momentum wheel, a rotating arm, and a second momentum wheel. Each turns on its own stationary shaft and is supported by a pair of tapered roller bearings mounted back to back. The outer ring of each bearing, the cup, turns with the rotating part, while the inner ring, the cone, is fixed to the shaft. Each part has its own drive motor.</w:t>
-      </w:r>
-    </w:p>
-    <w:p>
-      <w:pPr/>
-      <w:r>
-        <w:t xml:space="preserve">The arm is a long, slender body whose length runs perpendicular to its shaft. It turns about the shaft axis through complete revolutions, behaving like a seesaw that keeps going around rather than rocking back and forth. Because it is long and narrow, its inertia is very different about its two transverse axes, which matters for its dynamic imbalance.</w:t>
-      </w:r>
-    </w:p>
-    <w:p>
-      <w:pPr/>
-      <w:r>
-        <w:t xml:space="preserve">The two momentum wheels spin in the opposite direction to the arm and at a higher speed. Their purpose is to cancel the arm's angular momentum, so that the assembly as a whole does not exchange momentum with its mount when the parts speed up or slow down. All three parts follow the same operating profile: a spin-up from rest to a hold speed, a period at constant speed, and a spin-down back to rest.</w:t>
-      </w:r>
-    </w:p>
-    <w:p>
-      <w:pPr>
-        <w:pStyle w:val="Heading3"/>
-      </w:pPr>
-      <w:r>
-        <w:t xml:space="preserve">5.2 Axes and reference point</w:t>
-      </w:r>
-    </w:p>
-    <w:p>
-      <w:pPr/>
-      <w:r>
-        <w:t xml:space="preserve">The z axis is taken along the shafts, which is the spin axis of all three parts. The x and y axes lie perpendicular to the shafts. Forces and moments about x and y are referred to as lateral or sideways loads, while the force along z and the moment about z are referred to as axial force and twist. The position of each part is measured along z from a reference point, which is the location where the loads are wanted, normally the mounting interface. All moments in this paper are reported about that point.</w:t>
-      </w:r>
-    </w:p>
-    <w:p>
-      <w:pPr>
-        <w:pStyle w:val="Heading3"/>
-      </w:pPr>
-      <w:r>
-        <w:t xml:space="preserve">5.3 What was available</w:t>
-      </w:r>
-    </w:p>
-    <w:p>
-      <w:pPr/>
-      <w:r>
-        <w:t xml:space="preserve">The analysis had to be done before any hardware was built, so the available information was limited to design data.</w:t>
-      </w:r>
-    </w:p>
-    <w:tbl>
-      <w:tblPr>
-        <w:tblStyle w:val="TableGrid"/>
-        <w:tblW w:w="0" w:type="auto"/>
-        <w:tblLayout w:type="fixed"/>
-        <w:tblLook w:val="04A0" w:firstRow="1" w:lastRow="0" w:firstColumn="0" w:lastColumn="0" w:noHBand="0" w:noVBand="1"/>
-      </w:tblPr>
-      <w:tblGrid>
-        <w:gridCol w:w="4680"/>
-        <w:gridCol w:w="4680"/>
-      </w:tblGrid>
-      <w:tr>
-        <w:trPr>
-          <w:tblHeader/>
-        </w:trPr>
-        <w:tc>
-          <w:tcPr>
-            <w:tcW w:w="4680" w:type="dxa"/>
-            <w:shd w:val="clear" w:color="auto" w:fill="F2F2F2"/>
-          </w:tcPr>
-          <w:p>
-            <w:pPr/>
-            <w:r>
-              <w:t xml:space="preserve">Available</w:t>
-            </w:r>
-          </w:p>
-        </w:tc>
-        <w:tc>
-          <w:tcPr>
-            <w:tcW w:w="4680" w:type="dxa"/>
-            <w:shd w:val="clear" w:color="auto" w:fill="F2F2F2"/>
-          </w:tcPr>
-          <w:p>
-            <w:pPr/>
-            <w:r>
-              <w:t xml:space="preserve">Not available</w:t>
-            </w:r>
-          </w:p>
-        </w:tc>
-      </w:tr>
-      <w:tr>
-        <w:tc>
-          <w:tcPr>
-            <w:tcW w:w="4680" w:type="dxa"/>
-          </w:tcPr>
-          <w:p>
-            <w:pPr/>
-            <w:r>
-              <w:t xml:space="preserve">CAD mass properties for each rotating part: mass and the inertias Ixx, Iyy and Izz</w:t>
-            </w:r>
-          </w:p>
-        </w:tc>
-        <w:tc>
-          <w:tcPr>
-            <w:tcW w:w="4680" w:type="dxa"/>
-          </w:tcPr>
-          <w:p>
-            <w:pPr/>
-            <w:r>
-              <w:t xml:space="preserve">Balance reports or measured imbalance</w:t>
-            </w:r>
-          </w:p>
-        </w:tc>
-      </w:tr>
-      <w:tr>
-        <w:tc>
-          <w:tcPr>
-            <w:tcW w:w="4680" w:type="dxa"/>
-          </w:tcPr>
-          <w:p>
-            <w:pPr/>
-            <w:r>
-              <w:t xml:space="preserve">A specified center of mass offset (eccentricity) for each part</w:t>
-            </w:r>
-          </w:p>
-        </w:tc>
-        <w:tc>
-          <w:tcPr>
-            <w:tcW w:w="4680" w:type="dxa"/>
-          </w:tcPr>
-          <w:p>
-            <w:pPr/>
-            <w:r>
-              <w:t xml:space="preserve">Tilt tolerances between each part and its shaft</w:t>
-            </w:r>
-          </w:p>
-        </w:tc>
-      </w:tr>
-      <w:tr>
-        <w:tc>
-          <w:tcPr>
-            <w:tcW w:w="4680" w:type="dxa"/>
-          </w:tcPr>
-          <w:p>
-            <w:pPr/>
-            <w:r>
-              <w:t xml:space="preserve">Operating speeds and spin directions</w:t>
-            </w:r>
-          </w:p>
-        </w:tc>
-        <w:tc>
-          <w:tcPr>
-            <w:tcW w:w="4680" w:type="dxa"/>
-          </w:tcPr>
-          <w:p>
-            <w:pPr/>
-            <w:r>
-              <w:t xml:space="preserve">Bearing vibration data from the supplier</w:t>
-            </w:r>
-          </w:p>
-        </w:tc>
-      </w:tr>
-      <w:tr>
-        <w:tc>
-          <w:tcPr>
-            <w:tcW w:w="4680" w:type="dxa"/>
-          </w:tcPr>
-          <w:p>
-            <w:pPr/>
-            <w:r>
-              <w:t xml:space="preserve">Bearing catalog geometry: roller count, roller diameter, pitch diameter and cup angle</w:t>
-            </w:r>
-          </w:p>
-        </w:tc>
-        <w:tc>
-          <w:tcPr>
-            <w:tcW w:w="4680" w:type="dxa"/>
-          </w:tcPr>
-          <w:p>
-            <w:pPr/>
-            <w:r>
-              <w:t xml:space="preserve">Force table measurements of any kind</w:t>
-            </w:r>
-          </w:p>
-        </w:tc>
-      </w:tr>
-      <w:tr>
-        <w:tc>
-          <w:tcPr>
-            <w:tcW w:w="4680" w:type="dxa"/>
-          </w:tcPr>
-          <w:p>
-            <w:pPr/>
-            <w:r>
-              <w:t xml:space="preserve">The operating profile: spin-up, hold and spin-down</w:t>
-            </w:r>
-          </w:p>
-        </w:tc>
-        <w:tc>
-          <w:tcPr>
-            <w:tcW w:w="4680" w:type="dxa"/>
-          </w:tcPr>
-          <w:p>
-            <w:pPr/>
-            <w:r>
-              <w:t xml:space="preserve">A structural model of the mounting</w:t>
-            </w:r>
-          </w:p>
-        </w:tc>
-      </w:tr>
-    </w:tbl>
-    <w:p>
-      <w:pPr/>
-      <w:r>
-        <w:t xml:space="preserve">The CAD models are symmetric, so on their own they show no imbalance at all. The real imbalance comes from manufacturing and assembly tolerances, which is why the eccentricity specification, rather than the CAD geometry, sets the static imbalance. This shaped the whole approach: the method had to produce defensible loads from design data and tolerances alone, while being clear about which parts of the answer rest on estimates.</w:t>
-      </w:r>
-    </w:p>
-    <w:p>
-      <w:pPr>
-        <w:pStyle w:val="Heading2"/>
-      </w:pPr>
-      <w:r>
-        <w:t xml:space="preserve">6. Our Method</w:t>
-      </w:r>
-    </w:p>
-    <w:p>
-      <w:pPr>
-        <w:pStyle w:val="Heading3"/>
-      </w:pPr>
-      <w:r>
-        <w:t xml:space="preserve">6.1 Overall approach</w:t>
-      </w:r>
-    </w:p>
-    <w:p>
-      <w:pPr/>
-      <w:r>
-        <w:t xml:space="preserve">The method follows directly from the fundamentals in Section 2 and the equations in Section 3. Each rotating part is treated as a rigid rotor and examined for the three rotor effects: static imbalance, dynamic imbalance and reaction torque. The bearings under each part are then treated as a fourth source. The loads from every source are expressed as the six components Fx, Fy, Fz, Mx, My and Mz at a single reference point and added together.</w:t>
-      </w:r>
-    </w:p>
-    <w:p>
-      <w:pPr/>
-      <w:r>
-        <w:t xml:space="preserve">Three decisions frame everything that follows. First, the loads are hard-mounted, following the convention described in Section 4.1, so that they can be handed to a structural model without double counting the structure's response. Second, the results are peak amplitudes at the maximum operating speed, which is where imbalance loads are largest. Third, because the relative phases between sources are unknown, every peak is added as if it occurs at the same instant. Real loads will be equal to or lower than the reported values. Together these choices give an answer that is conservative, easy to check by hand, and in the form most useful at the early design stage.</w:t>
-      </w:r>
-    </w:p>
-    <w:p>
-      <w:pPr/>
-      <w:r>
-        <w:t xml:space="preserve">All three parts are handled by the same equations and the same code. Nothing in the method is specific to wheels or arms, so it applies equally to any number of rotors on parallel shafts, provided the inputs for each are supplied.</w:t>
-      </w:r>
-    </w:p>
-    <w:p>
-      <w:pPr/>
-      <w:r>
-        <w:t xml:space="preserve">Of the sources described in Section 2, the method includes those that can be estimated from the design data available: static imbalance, dynamic imbalance, motor reaction torque and the bearings. The remaining sources are left out for specific reasons. Motor ripple and cogging need the motor pole and slot counts and ripple data, which were not yet available. Broadband noise has no deterministic model and can only be measured. Gyroscopic moments are zero because all three shafts are stationary, and even if the assembly were carried on a moving base, the counter-rotating wheels are sized to bring its total angular momentum close to zero. Each of these can be added later without changing the rest of the method.</w:t>
-      </w:r>
-    </w:p>
-    <w:p>
-      <w:pPr>
-        <w:pStyle w:val="Heading3"/>
-      </w:pPr>
-      <w:r>
-        <w:t xml:space="preserve">6.2 Static imbalance from the eccentricity specification</w:t>
-      </w:r>
-    </w:p>
-    <w:p>
-      <w:pPr/>
-      <w:r>
-        <w:t xml:space="preserve">Because the CAD models are symmetric, the static imbalance was taken from the eccentricity specification rather than from the geometry. For each part, the specified offset e is multiplied by the rotating mass to give Us, and the lateral force at maximum speed follows from the square of the spin rate:</w:t>
-      </w:r>
-    </w:p>
-    <w:p>
-      <w:pPr>
-        <w:pStyle w:val="Code"/>
-      </w:pPr>
-      <w:bookmarkStart w:id="21" w:name="bongo_lang_latex_21"/>
-      <w:bookmarkEnd w:id="21"/>
-      <w:r>
-        <w:t xml:space="preserve">U_s = m\,e \qquad\qquad F_s = U_s\,\omega^2, \qquad \omega = \frac{2\pi\,\text{RPM}}{60}</w:t>
-      </w:r>
-    </w:p>
-    <w:p>
-      <w:pPr/>
-      <w:r>
-        <w:t xml:space="preserve">This force rotates with the part. It appears at the reference point as Fx and Fy, each with the same peak value, reached a quarter of a revolution apart. It produces no axial force.</w:t>
-      </w:r>
-    </w:p>
-    <w:p>
-      <w:pPr/>
-      <w:r>
-        <w:t xml:space="preserve">The method also allows Us to be entered directly. Once a balance specification or a balance report is available, its value replaces the one calculated from eccentricity, and the rest of the method is unchanged.</w:t>
-      </w:r>
-    </w:p>
-    <w:p>
-      <w:pPr>
-        <w:pStyle w:val="Heading3"/>
-      </w:pPr>
-      <w:r>
-        <w:t xml:space="preserve">6.3 Dynamic imbalance from inertia and an estimated tilt</w:t>
-      </w:r>
-    </w:p>
-    <w:p>
-      <w:pPr/>
-      <w:r>
-        <w:t xml:space="preserve">Dynamic imbalance needs two inputs: the difference between the spin and transverse inertias, which comes from CAD, and the tilt of the principal axis relative to the shaft, which was not specified. A small tilt was therefore assumed for each part, of a size consistent with ordinary machining and assembly tolerances. This is the least certain input in the imbalance calculation and is flagged as such in the results.</w:t>
-      </w:r>
-    </w:p>
-    <w:p>
-      <w:pPr/>
-      <w:r>
-        <w:t xml:space="preserve">The direction of the tilt is also unknown. For a rotor with equal transverse inertias, such as a wheel, this does not matter. For the arm it matters a great deal, because its inertia about one transverse axis is close to its spin inertia while its inertia about the other is very small. The method uses the larger of the two inertia differences, which corresponds to the worst tilt direction:</w:t>
-      </w:r>
-    </w:p>
-    <w:p>
-      <w:pPr>
-        <w:pStyle w:val="Code"/>
-      </w:pPr>
-      <w:bookmarkStart w:id="22" w:name="bongo_lang_latex_22"/>
-      <w:bookmarkEnd w:id="22"/>
-      <w:r>
-        <w:t xml:space="preserve">U_d = \max\left(\left|I_{zz}-I_{xx}\right|,\ \left|I_{zz}-I_{yy}\right|\right)\theta \qquad\qquad M_d = U_d\,\omega^2</w:t>
-      </w:r>
-    </w:p>
-    <w:p>
-      <w:pPr/>
-      <w:r>
-        <w:t xml:space="preserve">As with static imbalance, Ud can be entered directly when a balance specification provides it, and doing so removes the need for the tilt estimate altogether.</w:t>
-      </w:r>
-    </w:p>
-    <w:p>
-      <w:pPr>
-        <w:pStyle w:val="Heading3"/>
-      </w:pPr>
-      <w:r>
-        <w:t xml:space="preserve">6.4 Moments at the reference point</w:t>
-      </w:r>
-    </w:p>
-    <w:p>
-      <w:pPr/>
-      <w:r>
-        <w:t xml:space="preserve">Each part sits some distance L along the shaft from the reference point. Its lateral force therefore produces an additional moment at that point, on top of its own dynamic imbalance moment. The angle between the heavy spot and the direction of tilt is not known, so the two moments are added at full value:</w:t>
-      </w:r>
-    </w:p>
-    <w:p>
-      <w:pPr>
-        <w:pStyle w:val="Code"/>
-      </w:pPr>
-      <w:bookmarkStart w:id="23" w:name="bongo_lang_latex_23"/>
-      <w:bookmarkEnd w:id="23"/>
-      <w:r>
-        <w:t xml:space="preserve">M_x = M_y = M_d + F_s\,L, \qquad L = \left|z - z_{ref}\right|</w:t>
-      </w:r>
-    </w:p>
-    <w:p>
-      <w:pPr/>
-      <w:r>
-        <w:t xml:space="preserve">Moving the reference point changes the moments but not the forces. This lets the same calculation report loads at whichever interface the structures team needs.</w:t>
-      </w:r>
-    </w:p>
-    <w:p>
-      <w:pPr>
-        <w:pStyle w:val="Heading3"/>
-      </w:pPr>
-      <w:r>
-        <w:t xml:space="preserve">6.5 Twist during spin-up and spin-down</w:t>
-      </w:r>
-    </w:p>
-    <w:p>
-      <w:pPr/>
-      <w:r>
-        <w:t xml:space="preserve">The twist about the shaft was calculated from the spin inertia and the average angular acceleration of each ramp, treating spin-up and spin-down separately because they can have different durations:</w:t>
-      </w:r>
-    </w:p>
-    <w:p>
-      <w:pPr>
-        <w:pStyle w:val="Code"/>
-      </w:pPr>
-      <w:bookmarkStart w:id="24" w:name="bongo_lang_latex_24"/>
-      <w:bookmarkEnd w:id="24"/>
-      <w:r>
-        <w:t xml:space="preserve">M_{z,up} = -\,I_{zz}\,\frac{\omega}{t_{up}} \qquad\qquad M_{z,down} = +\,I_{zz}\,\frac{\omega}{t_{down}}</w:t>
-      </w:r>
-    </w:p>
-    <w:p>
-      <w:pPr/>
-      <w:r>
-        <w:t xml:space="preserve">The signs show that the mount is twisted one way during spin-up and the other way during spin-down, and that parts turning in opposite directions twist it in opposite senses. The load tables carry the larger of the two values for each part. When the twists of all three parts are added with their signs, the counter-rotating wheels largely cancel the arm, which is the purpose of the wheels. The net value is reported as the assembly's twist, but each motor mount still carries its own full torque, and those values are reported separately so that the individual mounts can be checked.</w:t>
-      </w:r>
-    </w:p>
-    <w:p>
-      <w:pPr>
-        <w:pStyle w:val="Heading3"/>
-      </w:pPr>
-      <w:r>
-        <w:t xml:space="preserve">6.6 Bearings</w:t>
-      </w:r>
-    </w:p>
-    <w:p>
-      <w:pPr/>
-      <w:r>
-        <w:t xml:space="preserve">The bearing calculation has two parts with very different levels of confidence. The frequencies are exact. For each part, the catalog geometry gives the cage, cup pass, cone pass and roller spin harmonics, using the cup-rotating forms from Section 3.6, and each harmonic is multiplied by the shaft speed to give its frequency in hertz. These frequencies are reported in full because they are what a structural analyst needs to check for resonance.</w:t>
-      </w:r>
-    </w:p>
-    <w:p>
-      <w:pPr/>
-      <w:r>
-        <w:t xml:space="preserve">The amplitudes are estimated. With no supplier or test data, each bearing harmonic was assumed to produce a lateral force equal to a small fraction k of that part's static imbalance force. A value of 1% was used. Tying the bearing estimate to the imbalance force keeps it in proportion to the size and speed of the part, and keeping k as a single, clearly labeled input makes it easy to change once real data arrives. Because the rollers in a tapered bearing sit at the cup angle α, each lateral kick was given an axial component as well. The four harmonics were added at full value:</w:t>
+        <w:t xml:space="preserve">7.8 Loads at other speeds</w:t>
+      </w:r>
+    </w:p>
+    <w:p>
+      <w:pPr/>
+      <w:r>
+        <w:t xml:space="preserve">Because every imbalance and bearing load scales with the square of speed, the loads at any other operating point follow from the maximum-speed values. The wheels track the arm at a fixed speed ratio, set by the requirement that they cancel its momentum, so a single arm speed defines the operating point:</w:t>
       </w:r>
     </w:p>
     <w:p>
@@ -3005,13 +3995,7 @@
       <w:bookmarkStart w:id="25" w:name="bongo_lang_latex_25"/>
       <w:bookmarkEnd w:id="25"/>
       <w:r>
-        <w:t xml:space="preserve">F_{lat} = 4\,k\,F_s \qquad\qquad F_{ax} = F_{lat}\tan\alpha \qquad\qquad M_{x} = M_{y} = F_{lat}\,L</w:t>
-      </w:r>
-    </w:p>
-    <w:p>
-      <w:pPr/>
-      <w:r>
-        <w:t xml:space="preserve">The two bearings of each back-to-back pair were treated together as a single source at the part's position. A more detailed model would place each bearing separately and account for preload, but that refinement only becomes meaningful once the amplitudes themselves are known.</w:t>
+        <w:t xml:space="preserve">L(\text{RPM}) = L_{max}\left(\frac{\text{RPM}}{\text{RPM}_{max}}\right)^2</w:t>
       </w:r>
     </w:p>
     <w:p>
@@ -3019,271 +4003,39 @@
         <w:pStyle w:val="Heading3"/>
       </w:pPr>
       <w:r>
-        <w:t xml:space="preserve">6.7 Combining the sources</w:t>
-      </w:r>
-    </w:p>
-    <w:p>
-      <w:pPr/>
-      <w:r>
-        <w:t xml:space="preserve">With every source expressed as six load components at the same reference point, the totals are found by adding them. The arm, the two wheels and all of the bearings are summed component by component. The twist is added with its sign, and its magnitude is reported as the net assembly twist. The results are presented in four groups so that each contribution can be seen on its own: the arm, the wheels, the bearings, and the assembly as a whole.</w:t>
-      </w:r>
-    </w:p>
-    <w:tbl>
-      <w:tblPr>
-        <w:tblStyle w:val="TableGrid"/>
-        <w:tblW w:w="0" w:type="auto"/>
-        <w:tblLayout w:type="fixed"/>
-        <w:tblLook w:val="04A0" w:firstRow="1" w:lastRow="0" w:firstColumn="0" w:lastColumn="0" w:noHBand="0" w:noVBand="1"/>
-      </w:tblPr>
-      <w:tblGrid>
-        <w:gridCol w:w="3120"/>
-        <w:gridCol w:w="3120"/>
-        <w:gridCol w:w="3120"/>
-      </w:tblGrid>
-      <w:tr>
-        <w:trPr>
-          <w:tblHeader/>
-        </w:trPr>
-        <w:tc>
-          <w:tcPr>
-            <w:tcW w:w="3120" w:type="dxa"/>
-            <w:shd w:val="clear" w:color="auto" w:fill="F2F2F2"/>
-          </w:tcPr>
-          <w:p>
-            <w:pPr/>
-            <w:r>
-              <w:t xml:space="preserve">Load</w:t>
-            </w:r>
-          </w:p>
-        </w:tc>
-        <w:tc>
-          <w:tcPr>
-            <w:tcW w:w="3120" w:type="dxa"/>
-            <w:shd w:val="clear" w:color="auto" w:fill="F2F2F2"/>
-          </w:tcPr>
-          <w:p>
-            <w:pPr/>
-            <w:r>
-              <w:t xml:space="preserve">Arm and each wheel</w:t>
-            </w:r>
-          </w:p>
-        </w:tc>
-        <w:tc>
-          <w:tcPr>
-            <w:tcW w:w="3120" w:type="dxa"/>
-            <w:shd w:val="clear" w:color="auto" w:fill="F2F2F2"/>
-          </w:tcPr>
-          <w:p>
-            <w:pPr/>
-            <w:r>
-              <w:t xml:space="preserve">Bearings</w:t>
-            </w:r>
-          </w:p>
-        </w:tc>
-      </w:tr>
-      <w:tr>
-        <w:tc>
-          <w:tcPr>
-            <w:tcW w:w="3120" w:type="dxa"/>
-          </w:tcPr>
-          <w:p>
-            <w:pPr/>
-            <w:r>
-              <w:t xml:space="preserve">Fx, Fy</w:t>
-            </w:r>
-          </w:p>
-        </w:tc>
-        <w:tc>
-          <w:tcPr>
-            <w:tcW w:w="3120" w:type="dxa"/>
-          </w:tcPr>
-          <w:p>
-            <w:pPr/>
-            <w:r>
-              <w:t xml:space="preserve">Fs</w:t>
-            </w:r>
-          </w:p>
-        </w:tc>
-        <w:tc>
-          <w:tcPr>
-            <w:tcW w:w="3120" w:type="dxa"/>
-          </w:tcPr>
-          <w:p>
-            <w:pPr/>
-            <w:r>
-              <w:t xml:space="preserve">F_lat</w:t>
-            </w:r>
-          </w:p>
-        </w:tc>
-      </w:tr>
-      <w:tr>
-        <w:tc>
-          <w:tcPr>
-            <w:tcW w:w="3120" w:type="dxa"/>
-          </w:tcPr>
-          <w:p>
-            <w:pPr/>
-            <w:r>
-              <w:t xml:space="preserve">Fz</w:t>
-            </w:r>
-          </w:p>
-        </w:tc>
-        <w:tc>
-          <w:tcPr>
-            <w:tcW w:w="3120" w:type="dxa"/>
-          </w:tcPr>
-          <w:p>
-            <w:pPr/>
-            <w:r>
-              <w:t xml:space="preserve">0</w:t>
-            </w:r>
-          </w:p>
-        </w:tc>
-        <w:tc>
-          <w:tcPr>
-            <w:tcW w:w="3120" w:type="dxa"/>
-          </w:tcPr>
-          <w:p>
-            <w:pPr/>
-            <w:r>
-              <w:t xml:space="preserve">F_ax</w:t>
-            </w:r>
-          </w:p>
-        </w:tc>
-      </w:tr>
-      <w:tr>
-        <w:tc>
-          <w:tcPr>
-            <w:tcW w:w="3120" w:type="dxa"/>
-          </w:tcPr>
-          <w:p>
-            <w:pPr/>
-            <w:r>
-              <w:t xml:space="preserve">Mx, My</w:t>
-            </w:r>
-          </w:p>
-        </w:tc>
-        <w:tc>
-          <w:tcPr>
-            <w:tcW w:w="3120" w:type="dxa"/>
-          </w:tcPr>
-          <w:p>
-            <w:pPr/>
-            <w:r>
-              <w:t xml:space="preserve">Md + Fs × L</w:t>
-            </w:r>
-          </w:p>
-        </w:tc>
-        <w:tc>
-          <w:tcPr>
-            <w:tcW w:w="3120" w:type="dxa"/>
-          </w:tcPr>
-          <w:p>
-            <w:pPr/>
-            <w:r>
-              <w:t xml:space="preserve">F_lat × L</w:t>
-            </w:r>
-          </w:p>
-        </w:tc>
-      </w:tr>
-      <w:tr>
-        <w:tc>
-          <w:tcPr>
-            <w:tcW w:w="3120" w:type="dxa"/>
-          </w:tcPr>
-          <w:p>
-            <w:pPr/>
-            <w:r>
-              <w:t xml:space="preserve">Mz</w:t>
-            </w:r>
-          </w:p>
-        </w:tc>
-        <w:tc>
-          <w:tcPr>
-            <w:tcW w:w="3120" w:type="dxa"/>
-          </w:tcPr>
-          <w:p>
-            <w:pPr/>
-            <w:r>
-              <w:t xml:space="preserve">Izz × ω / t (larger ramp)</w:t>
-            </w:r>
-          </w:p>
-        </w:tc>
-        <w:tc>
-          <w:tcPr>
-            <w:tcW w:w="3120" w:type="dxa"/>
-          </w:tcPr>
-          <w:p>
-            <w:pPr/>
-            <w:r>
-              <w:t xml:space="preserve">0, since bearing drag is reacted inside the assembly by the motor</w:t>
-            </w:r>
-          </w:p>
-        </w:tc>
-      </w:tr>
-    </w:tbl>
+        <w:t xml:space="preserve">7.9 How the method was developed</w:t>
+      </w:r>
+    </w:p>
+    <w:p>
+      <w:pPr/>
+      <w:r>
+        <w:t xml:space="preserve">The work started from the task itself, which was to estimate the forces and moments induced by the two wheels, the arm and the bearings, using analysis alone. The first step was to identify every mechanism by which a rigid rotor on a fixed shaft can load its mount. Working from Newton's and Euler's equations showed that there are only three, and that the bearings form a fourth, separate source. This gave a complete list of sources before any equations were written, and it made clear which effects could be calculated from design data and which could not.</w:t>
+      </w:r>
+    </w:p>
+    <w:p>
+      <w:pPr/>
+      <w:r>
+        <w:t xml:space="preserve">The reference material on reaction wheel disturbance modeling was then reviewed to confirm that the same sources and the same speed-squared scaling are used in practice. It also showed how measured data is normally folded in later, which shaped the decision to keep every estimated quantity as a single, visible input that can be replaced.</w:t>
+      </w:r>
+    </w:p>
+    <w:p>
+      <w:pPr/>
+      <w:r>
+        <w:t xml:space="preserve">The method was then built as a script, kept deliberately short so that every line could be followed and checked. It was compared with a separate, much larger set of time-domain models covering the same hardware. Those models used the same equations for every effect included here, and the additional terms they carry are either negligible for our ramp times, zero for stationary shafts, or dependent on test data we do not yet have.</w:t>
+      </w:r>
+    </w:p>
+    <w:p>
+      <w:pPr/>
+      <w:r>
+        <w:t xml:space="preserve">An independent review of an early version raised several points about how results could be misread. In response, the output now states that Fx and Fy are peaks reached a quarter turn apart rather than simultaneous values, labels every result as a worst-case estimate, identifies which inputs are estimates, and reports spin-up and spin-down twist separately. The built-in checks are also described as checks on the arithmetic, not on the physical inputs.</w:t>
+      </w:r>
+    </w:p>
     <w:p>
       <w:pPr>
         <w:pStyle w:val="Heading3"/>
       </w:pPr>
       <w:r>
-        <w:t xml:space="preserve">6.8 Loads at other speeds</w:t>
-      </w:r>
-    </w:p>
-    <w:p>
-      <w:pPr/>
-      <w:r>
-        <w:t xml:space="preserve">Because every imbalance and bearing load scales with the square of speed, the loads at any other operating point follow from the maximum-speed values. The wheels track the arm at a fixed speed ratio, set by the requirement that they cancel its momentum, so a single arm speed defines the operating point:</w:t>
-      </w:r>
-    </w:p>
-    <w:p>
-      <w:pPr>
-        <w:pStyle w:val="Code"/>
-      </w:pPr>
-      <w:bookmarkStart w:id="26" w:name="bongo_lang_latex_26"/>
-      <w:bookmarkEnd w:id="26"/>
-      <w:r>
-        <w:t xml:space="preserve">L(\text{RPM}) = L_{max}\left(\frac{\text{RPM}}{\text{RPM}_{max}}\right)^2</w:t>
-      </w:r>
-    </w:p>
-    <w:p>
-      <w:pPr>
-        <w:pStyle w:val="Heading3"/>
-      </w:pPr>
-      <w:r>
-        <w:t xml:space="preserve">6.9 How the method was developed</w:t>
-      </w:r>
-    </w:p>
-    <w:p>
-      <w:pPr/>
-      <w:r>
-        <w:t xml:space="preserve">The work started from the task itself, which was to estimate the forces and moments induced by the two wheels, the arm and the bearings, using analysis alone. The first step was to identify every mechanism by which a rigid rotor on a fixed shaft can load its mount. Working from Newton's and Euler's equations showed that there are only three, and that the bearings form a fourth, separate source. This gave a complete list of sources before any equations were written, and it made clear which effects could be calculated from design data and which could not.</w:t>
-      </w:r>
-    </w:p>
-    <w:p>
-      <w:pPr/>
-      <w:r>
-        <w:t xml:space="preserve">The reference material on reaction wheel disturbance modeling was then reviewed to confirm that the same sources and the same speed-squared scaling are used in practice. It also showed how measured data is normally folded in later, which shaped the decision to keep every estimated quantity as a single, visible input that can be replaced.</w:t>
-      </w:r>
-    </w:p>
-    <w:p>
-      <w:pPr/>
-      <w:r>
-        <w:t xml:space="preserve">The method was then built as a script, kept deliberately short so that every line could be followed and checked. It was compared with a separate, much larger set of time-domain models covering the same hardware. Those models used the same equations for every effect included here, and the additional terms they carry are either negligible for our ramp times, zero for stationary shafts, or dependent on test data we do not yet have.</w:t>
-      </w:r>
-    </w:p>
-    <w:p>
-      <w:pPr/>
-      <w:r>
-        <w:t xml:space="preserve">An independent review of an early version raised several points about how results could be misread. In response, the output now states that Fx and Fy are peaks reached a quarter turn apart rather than simultaneous values, labels every result as a worst-case estimate, identifies which inputs are estimates, and reports spin-up and spin-down twist separately. The built-in checks are also described as checks on the arithmetic, not on the physical inputs.</w:t>
-      </w:r>
-    </w:p>
-    <w:p>
-      <w:pPr>
-        <w:pStyle w:val="Heading3"/>
-      </w:pPr>
-      <w:r>
-        <w:t xml:space="preserve">6.10 Implementation</w:t>
+        <w:t xml:space="preserve">7.10 Implementation</w:t>
       </w:r>
     </w:p>
     <w:p>
@@ -3339,7 +4091,7 @@
         <w:pStyle w:val="Heading2"/>
       </w:pPr>
       <w:r>
-        <w:t xml:space="preserve">7. Assumptions and Limitations</w:t>
+        <w:t xml:space="preserve">8. Assumptions and Limitations</w:t>
       </w:r>
     </w:p>
     <w:p>
@@ -3365,19 +4117,19 @@
         <w:pStyle w:val="Heading2"/>
       </w:pPr>
       <w:r>
-        <w:t xml:space="preserve">8. Next Steps and Conclusion</w:t>
-      </w:r>
-    </w:p>
-    <w:p>
-      <w:pPr/>
-      <w:r>
-        <w:t xml:space="preserve">The next steps follow directly from the estimates and exclusions above. The example inputs will be replaced with the final CAD mass properties, speeds, positions and bearing part numbers. The tilt estimate will be replaced with Ud from a balance specification, and the bearing kick ratio with supplier data or a bearing test. Motor torque ripple can be added once the motor pole and slot counts and ripple data are known. The loads and the bearing frequencies will be passed to the structural analysis to check for modes close to any disturbance frequency, and once hardware is built, the assembly will be measured on a force table and compared with these estimates.</w:t>
-      </w:r>
-    </w:p>
-    <w:p>
-      <w:pPr/>
-      <w:r>
-        <w:t xml:space="preserve">Induced vibration from rotating machinery comes down to a short list of physical effects. A rotor whose center of mass is off its axis pushes sideways. A rotor that sits tilted rocks its shaft. A rotor that changes speed twists its mount. The bearings add small kicks at frequencies set by their geometry. For our assembly, each of these was estimated from design data alone, in a form that is conservative, can be checked by hand, and can be refined one input at a time as better data becomes available. With the example inputs, the wheels dominate the lateral loads because of their higher speed, and their counter-rotation cancels nearly all of the arm's twist on the assembly.</w:t>
+        <w:t xml:space="preserve">9. Next Steps and Conclusion</w:t>
+      </w:r>
+    </w:p>
+    <w:p>
+      <w:pPr/>
+      <w:r>
+        <w:t xml:space="preserve">The next steps follow directly from the estimates and exclusions above. The final CAD mass properties, speeds, positions and bearing part numbers will be entered to produce the load values for our hardware. The tilt estimate will be replaced with Ud from a balance specification, and the bearing kick ratio with supplier data or a bearing test. Motor torque ripple can be added once the motor pole and slot counts and ripple data are known. The loads and the bearing frequencies will be passed to the structural analysis to check for modes close to any disturbance frequency, and once hardware is built, the assembly will be measured on a force table and compared with these estimates.</w:t>
+      </w:r>
+    </w:p>
+    <w:p>
+      <w:pPr/>
+      <w:r>
+        <w:t xml:space="preserve">Induced vibration from rotating machinery comes down to a short list of physical effects. A rotor whose center of mass is off its axis pushes sideways. A rotor that sits tilted rocks its shaft. A rotor that changes speed twists its mount. The bearings add small kicks at frequencies set by their geometry. For our assembly, each of these was estimated from design data alone, in a form that is conservative, can be checked by hand, and can be refined one input at a time as better data becomes available.</w:t>
       </w:r>
     </w:p>
     <w:p>

</xml_diff>